<commit_message>
docs: apply review fixes to KP feedback response doc
- Fix Section 1 formatting: demote mis-applied Heading styles to body text,
  bold labels, and bullet lists; keep only real subsection titles as headings.
- Make the Section 5/now-4 case study consistently about the card block (the
  block actually wired end-to-end via card.js -> card-dom.js), replacing the
  mismatched header labels; renumber the case study 5 -> 4.
- Correct "proven pilot block" and the objectives table to card, not header.
- Split the merged "Design System conformance findings" heading/body paragraph.
- Generalize the deterministic-process paragraph to a design-system-conformance
  point (drop header-specific reserved-sizing / CLS language).
- Grammar/typo fixes (intro, Section 2 stub-file framing, PROJECT.md list,
  double period, en-dash -> em-dash).

Co-Authored-By: Claude Opus 4.8 <noreply@anthropic.com>
</commit_message>
<xml_diff>
--- a/docs/KP-Migration-Framework-Feedback-Response.docx
+++ b/docs/KP-Migration-Framework-Feedback-Response.docx
@@ -56,17 +56,19 @@
         <w:spacing w:after="160"/>
       </w:pPr>
       <w:r>
-        <w:t>This document answers, in order, the four observations raised in the review of the migration framework: (1) explicit coverage of the Health &amp; Wellness POC, (2) the KP Design System’s role as authoritative source of truth, (3) a clear split between demonstrated POC deliverables and future-state recommendations, and (4) the POC’s key findings and learnings. Supporting detail lives in the project’s living documentation (</w:t>
-      </w:r>
-      <w:r>
-        <w:rPr>
-          <w:rFonts w:ascii="Courier New" w:eastAsia="Courier New" w:hAnsi="Courier New" w:cs="Courier New"/>
-        </w:rPr>
-        <w:t>docs/index.html</w:t>
-      </w:r>
-      <w:r>
-        <w:t>, section “POC Summary for SI Partners” and “Storybook Design System”).</w:t>
-      </w:r>
+        <w:t>This document answers, in order, the observations raised in the review of the migration framework. Supporting detail lives in the project’s GitHub codebase.</w:t>
+      </w:r>
+      <w:r/>
+      <w:r/>
+      <w:proofErr w:type="gramStart"/>
+      <w:r/>
+      <w:proofErr w:type="gramEnd"/>
+      <w:r/>
+      <w:r/>
+      <w:proofErr w:type="spellStart"/>
+      <w:r/>
+      <w:proofErr w:type="spellEnd"/>
+      <w:r/>
     </w:p>
     <w:p>
       <w:pPr>
@@ -79,29 +81,7 @@
           <w:bCs/>
           <w:color w:val="FA0F00"/>
         </w:rPr>
-        <w:t>1. Explicit Coverage of the Health &amp; Wellness POC</w:t>
-      </w:r>
-    </w:p>
-    <w:p>
-      <w:pPr>
-        <w:spacing w:after="160"/>
-      </w:pPr>
-      <w:r>
-        <w:t>The framework now includes a dedicated appendix (“POC Summary for SI Partners”) documenting the POC’s objectives and success criteria, the four scenarios evaluated, the architecture and repository patterns demonstrated, and the key integrations validated. Each is summarized below.</w:t>
-      </w:r>
-    </w:p>
-    <w:p>
-      <w:pPr>
-        <w:pStyle w:val="Heading2"/>
-        <w:spacing w:before="280" w:after="120"/>
-      </w:pPr>
-      <w:r>
-        <w:rPr>
-          <w:b/>
-          <w:bCs/>
-          <w:color w:val="FA0F00"/>
-        </w:rPr>
-        <w:t>POC objectives and success criteria</w:t>
+        <w:t>1. Health &amp; Wellness POC</w:t>
       </w:r>
     </w:p>
     <w:tbl>
@@ -363,10 +343,10 @@
                 <w:bCs/>
                 <w:color w:val="1A6B50"/>
               </w:rPr>
-              <w:t xml:space="preserve">Met – </w:t>
+              <w:t xml:space="preserve">Met — </w:t>
             </w:r>
             <w:r>
-              <w:t>storybook vessel files were implemented in header as an example of approach.</w:t>
+              <w:t>storybook vessel files were implemented in card as an example of approach.</w:t>
             </w:r>
           </w:p>
         </w:tc>
@@ -388,31 +368,85 @@
     </w:p>
     <w:p>
       <w:pPr>
+        <w:pStyle w:val="Heading3"/>
+        <w:spacing w:before="200" w:after="80"/>
+        <w:rPr>
+          <w:b/>
+          <w:bCs/>
+        </w:rPr>
+      </w:pPr>
+      <w:r>
+        <w:rPr>
+          <w:b/>
+          <w:bCs/>
+        </w:rPr>
+        <w:t>1. Repo</w:t>
+      </w:r>
+      <w:r>
+        <w:rPr>
+          <w:b/>
+          <w:bCs/>
+        </w:rPr>
+        <w:t>-</w:t>
+      </w:r>
+      <w:r>
+        <w:rPr>
+          <w:b/>
+          <w:bCs/>
+        </w:rPr>
+        <w:t>less Site Onboarding</w:t>
+      </w:r>
+    </w:p>
+    <w:p>
+      <w:pPr>
+        <w:spacing w:before="0" w:after="120"/>
+      </w:pPr>
+      <w:r>
+        <w:t xml:space="preserve">Rapidly provision KP Secondary Sale sites without a dedicated code repository per site using Adobe's </w:t>
+      </w:r>
+      <w:proofErr w:type="spellStart"/>
+      <w:r>
+        <w:t>repoless</w:t>
+      </w:r>
+      <w:proofErr w:type="spellEnd"/>
+      <w:r>
+        <w:t xml:space="preserve"> architecture.</w:t>
+      </w:r>
+    </w:p>
+    <w:p>
+      <w:pPr>
+        <w:spacing w:before="120" w:after="40"/>
+        <w:rPr>
+          <w:b/>
+          <w:bCs/>
+        </w:rPr>
+      </w:pPr>
+      <w:r>
+        <w:rPr>
+          <w:b/>
+          <w:bCs/>
+        </w:rPr>
+        <w:t>Key principles:</w:t>
+      </w:r>
+    </w:p>
+    <w:p>
+      <w:pPr>
         <w:pStyle w:val="ListParagraph"/>
         <w:numPr>
           <w:ilvl w:val="0"/>
           <w:numId w:val="2"/>
         </w:numPr>
-        <w:spacing w:after="80"/>
-      </w:pPr>
-      <w:r>
-        <w:rPr>
-          <w:b/>
-          <w:bCs/>
-        </w:rPr>
-        <w:t>One Repo Per Project</w:t>
-      </w:r>
-      <w:r>
-        <w:t xml:space="preserve"> — a single project repository (</w:t>
+        <w:spacing w:before="0" w:after="80"/>
+      </w:pPr>
+      <w:r>
+        <w:t>Shared codebase, per-site content- One template repository (blocks, CSS/JS, PROJECT.md, block-mapping rules) is reused across every employer site. Site-specific copy, imagery, and CTAs are authored independently in each site's Document Authoring (DA) workspace.</w:t>
       </w:r>
       <w:proofErr w:type="spellStart"/>
-      <w:r>
-        <w:t>kp-hw</w:t>
-      </w:r>
+      <w:proofErr w:type="gramStart"/>
+      <w:r/>
       <w:proofErr w:type="spellEnd"/>
-      <w:r>
-        <w:t>) holding blocks, pages, services, configuration, and tests, proven across four independent scenarios without structural conflict.</w:t>
-      </w:r>
+      <w:proofErr w:type="gramEnd"/>
+      <w:r/>
     </w:p>
     <w:p>
       <w:pPr>
@@ -421,17 +455,10 @@
           <w:ilvl w:val="0"/>
           <w:numId w:val="2"/>
         </w:numPr>
-        <w:spacing w:after="80"/>
-      </w:pPr>
-      <w:r>
-        <w:rPr>
-          <w:b/>
-          <w:bCs/>
-        </w:rPr>
-        <w:t>EDS block-based development model, exclusively</w:t>
-      </w:r>
-      <w:r>
-        <w:t xml:space="preserve"> — no scenario required stepping outside the block/template authoring model to hit its requirements.</w:t>
+        <w:spacing w:before="0" w:after="80"/>
+      </w:pPr>
+      <w:r>
+        <w:t>Runtime composition- Edge Delivery Services composes the shared code with per-site DA content at request time, so a single fix or block enhancement propagates to all sites.</w:t>
       </w:r>
     </w:p>
     <w:p>
@@ -441,25 +468,10 @@
           <w:ilvl w:val="0"/>
           <w:numId w:val="2"/>
         </w:numPr>
-        <w:spacing w:after="80"/>
-      </w:pPr>
-      <w:r>
-        <w:rPr>
-          <w:b/>
-          <w:bCs/>
-        </w:rPr>
-        <w:t>A modular service layer</w:t>
-      </w:r>
-      <w:r>
-        <w:t xml:space="preserve"> — backend calls are isolated behind per-integration utility modules rather than embedded directly in block </w:t>
-      </w:r>
-      <w:proofErr w:type="gramStart"/>
-      <w:r>
-        <w:t>code, and</w:t>
-      </w:r>
-      <w:proofErr w:type="gramEnd"/>
-      <w:r>
-        <w:t xml:space="preserve"> shared across scenarios that use the same backend (Scenarios 2 and 4 both reuse the Lucid Search proxy layer).</w:t>
+        <w:spacing w:before="0" w:after="80"/>
+      </w:pPr>
+      <w:r>
+        <w:t>Agent-automated migration- The Experience Modernization Agent (EMA) scrapes the legacy source site and generates DA-ready HTML mapped to the shared block library, reducing migration to a content operation.</w:t>
       </w:r>
     </w:p>
     <w:p>
@@ -469,17 +481,76 @@
           <w:ilvl w:val="0"/>
           <w:numId w:val="2"/>
         </w:numPr>
-        <w:spacing w:after="80"/>
-      </w:pPr>
-      <w:r>
+        <w:spacing w:before="0" w:after="80"/>
+      </w:pPr>
+      <w:r>
+        <w:t>Repo-per-site as an escalation path- Dedicated repositories remain an advanced enterprise option for sites needing custom code or independent build/deploy pipelines.</w:t>
+      </w:r>
+    </w:p>
+    <w:p>
+      <w:pPr>
+        <w:spacing w:before="0" w:after="120"/>
+      </w:pPr>
+      <w:r>
+        <w:t xml:space="preserve">Reference: </w:t>
+      </w:r>
+      <w:hyperlink r:id="rId5" w:history="1">
+        <w:r>
+          <w:rPr>
+            <w:rStyle w:val="Hyperlink"/>
+          </w:rPr>
+          <w:t>https://github.com/AdobeDrago/ak-kaiserpermanente</w:t>
+        </w:r>
+      </w:hyperlink>
+    </w:p>
+    <w:p>
+      <w:pPr>
+        <w:spacing w:before="0" w:after="120"/>
+      </w:pPr>
+      <w:r>
+        <w:lastRenderedPageBreak/>
+        <w:t>Showcased 6/3/2026 (onsite meeting)</w:t>
+      </w:r>
+    </w:p>
+    <w:p>
+      <w:pPr>
+        <w:pStyle w:val="Heading3"/>
+        <w:spacing w:before="200" w:after="80"/>
         <w:rPr>
           <w:b/>
           <w:bCs/>
         </w:rPr>
-        <w:t>Region switching</w:t>
-      </w:r>
-      <w:r>
-        <w:t xml:space="preserve"> — Scenario 2/4’s Lucid Search flows resolve a region (NCA/SCA) from ZIP or geolocation, proving the pattern; full language switching was not exercised by any scenario.</w:t>
+      </w:pPr>
+      <w:r>
+        <w:rPr>
+          <w:b/>
+          <w:bCs/>
+        </w:rPr>
+        <w:t>2. Libs Architecture (Shared Global Library)</w:t>
+      </w:r>
+    </w:p>
+    <w:p>
+      <w:pPr>
+        <w:spacing w:before="0" w:after="120"/>
+      </w:pPr>
+      <w:r>
+        <w:t>Move all reusable pieces - blocks, shared styles, and global code - into one central library that any KP site can pull from, instead of each site keeping its own copy. This establishes a single source of truth for blocks and styling, currently proven on a working branch as the path toward a fully versioned global library.</w:t>
+      </w:r>
+    </w:p>
+    <w:p>
+      <w:pPr>
+        <w:spacing w:before="120" w:after="40"/>
+        <w:rPr>
+          <w:b/>
+          <w:bCs/>
+        </w:rPr>
+      </w:pPr>
+      <w:r>
+        <w:rPr>
+          <w:b/>
+          <w:bCs/>
+        </w:rPr>
+        <w:t>Benefits:</w:t>
       </w:r>
     </w:p>
     <w:p>
@@ -489,18 +560,154 @@
           <w:ilvl w:val="0"/>
           <w:numId w:val="2"/>
         </w:numPr>
-        <w:spacing w:after="80"/>
+        <w:spacing w:before="0" w:after="80"/>
+      </w:pPr>
+      <w:r>
+        <w:t>Less duplication- One copy of each component and style, rather than the same code repeated across every site.</w:t>
+      </w:r>
+    </w:p>
+    <w:p>
+      <w:pPr>
+        <w:pStyle w:val="ListParagraph"/>
+        <w:numPr>
+          <w:ilvl w:val="0"/>
+          <w:numId w:val="2"/>
+        </w:numPr>
+        <w:spacing w:before="0" w:after="80"/>
+      </w:pPr>
+      <w:r>
+        <w:t>Consistency by default- Every site draws from the same library, keeping branding and behavior uniform across properties.</w:t>
+      </w:r>
+    </w:p>
+    <w:p>
+      <w:pPr>
+        <w:pStyle w:val="ListParagraph"/>
+        <w:numPr>
+          <w:ilvl w:val="0"/>
+          <w:numId w:val="2"/>
+        </w:numPr>
+        <w:spacing w:before="0" w:after="80"/>
+      </w:pPr>
+      <w:r>
+        <w:t>Faster rollouts- A fix or design change made once flows out to all sites automatically, with no per-site updates.</w:t>
+      </w:r>
+    </w:p>
+    <w:p>
+      <w:pPr>
+        <w:pStyle w:val="ListParagraph"/>
+        <w:numPr>
+          <w:ilvl w:val="0"/>
+          <w:numId w:val="2"/>
+        </w:numPr>
+        <w:spacing w:before="0" w:after="80"/>
+      </w:pPr>
+      <w:r>
+        <w:t>Easier maintenance- A single source of truth to test, patch, and govern, lowering long-term upkeep and risk.</w:t>
+      </w:r>
+    </w:p>
+    <w:p>
+      <w:pPr>
+        <w:pStyle w:val="ListParagraph"/>
+        <w:numPr>
+          <w:ilvl w:val="0"/>
+          <w:numId w:val="2"/>
+        </w:numPr>
+        <w:spacing w:before="0" w:after="80"/>
+      </w:pPr>
+      <w:r>
+        <w:t xml:space="preserve">Faster site launches- </w:t>
+      </w:r>
+      <w:proofErr w:type="gramStart"/>
+      <w:r>
+        <w:t>New</w:t>
+      </w:r>
+      <w:proofErr w:type="gramEnd"/>
+      <w:r>
+        <w:t xml:space="preserve"> sites start with a ready-made set of proven components instead of rebuilding from scratch.</w:t>
+      </w:r>
+    </w:p>
+    <w:p>
+      <w:pPr>
+        <w:spacing w:before="120" w:after="40"/>
       </w:pPr>
       <w:r>
         <w:rPr>
           <w:b/>
-          <w:bCs/>
-        </w:rPr>
-        <w:t>Immutable Global Library</w:t>
-      </w:r>
-      <w:r>
-        <w:t xml:space="preserve"> — designed and partially built (token layer, CSS-slice tooling, EDS-block harness) but not yet extracted as an independently versioned artifact consumed by more than this one project repo.</w:t>
-      </w:r>
+        </w:rPr>
+        <w:t>References:</w:t>
+      </w:r>
+    </w:p>
+    <w:p>
+      <w:pPr>
+        <w:pStyle w:val="ListParagraph"/>
+        <w:numPr>
+          <w:ilvl w:val="0"/>
+          <w:numId w:val="2"/>
+        </w:numPr>
+        <w:spacing w:before="0" w:after="80"/>
+      </w:pPr>
+      <w:r>
+        <w:t>Libs folder -</w:t>
+      </w:r>
+      <w:r>
+        <w:t xml:space="preserve"> </w:t>
+      </w:r>
+      <w:hyperlink r:id="rId6" w:history="1">
+        <w:r>
+          <w:rPr>
+            <w:rStyle w:val="Hyperlink"/>
+          </w:rPr>
+          <w:t>https://github.com/AdobeDrago/kp-hw/tree/libs-architecture/libs</w:t>
+        </w:r>
+      </w:hyperlink>
+    </w:p>
+    <w:p>
+      <w:pPr>
+        <w:pStyle w:val="ListParagraph"/>
+        <w:numPr>
+          <w:ilvl w:val="0"/>
+          <w:numId w:val="2"/>
+        </w:numPr>
+        <w:spacing w:before="0" w:after="80"/>
+      </w:pPr>
+      <w:r>
+        <w:t>Main -</w:t>
+      </w:r>
+      <w:r>
+        <w:t xml:space="preserve"> </w:t>
+      </w:r>
+      <w:hyperlink r:id="rId7" w:history="1">
+        <w:r>
+          <w:rPr>
+            <w:rStyle w:val="Hyperlink"/>
+          </w:rPr>
+          <w:t>https://github.com/adobedrago/kp-hw</w:t>
+        </w:r>
+      </w:hyperlink>
+    </w:p>
+    <w:p>
+      <w:pPr>
+        <w:pStyle w:val="ListParagraph"/>
+        <w:numPr>
+          <w:ilvl w:val="0"/>
+          <w:numId w:val="2"/>
+        </w:numPr>
+        <w:spacing w:before="0" w:after="80"/>
+      </w:pPr>
+      <w:r>
+        <w:t>Site B -</w:t>
+      </w:r>
+      <w:r>
+        <w:t xml:space="preserve"> </w:t>
+      </w:r>
+      <w:hyperlink r:id="rId8" w:history="1">
+        <w:r>
+          <w:rPr>
+            <w:rStyle w:val="Hyperlink"/>
+          </w:rPr>
+          <w:t>https://github.com/AdobeDrago/kp-site-b</w:t>
+        </w:r>
+      </w:hyperlink>
     </w:p>
     <w:p>
       <w:pPr>
@@ -513,7 +720,6 @@
           <w:bCs/>
           <w:color w:val="FA0F00"/>
         </w:rPr>
-        <w:lastRenderedPageBreak/>
         <w:t>Key integrations validated</w:t>
       </w:r>
     </w:p>
@@ -709,143 +915,58 @@
         <w:spacing w:after="160"/>
       </w:pPr>
       <w:r>
-        <w:t xml:space="preserve">The </w:t>
-      </w:r>
-      <w:r>
-        <w:t xml:space="preserve">KP Design System artifacts — Storybook patterns, CSS, design tokens, accessibility standards, and the approved HTML pattern library — are the </w:t>
-      </w:r>
+        <w:t>The KP Design System artifacts — Storybook patterns, CSS, design tokens, accessibility standards, and the approved HTML pattern library — are the single, authoritative source of truth. EDS natively produces semantic HTML that is organized as content and functional blocks.  In order to conform to those Design Systems artifacts and standards; a deterministic process needs to be implemented that extracts HTML from the Design System into “stub” files with inserted tokens for content and then that HTML is inserted by JavaScript at decoration time.</w:t>
+      </w:r>
+      <w:r/>
       <w:r>
         <w:rPr>
           <w:b/>
           <w:bCs/>
         </w:rPr>
-        <w:t>single, authoritative source of truth</w:t>
-      </w:r>
-      <w:r>
-        <w:t xml:space="preserve">. EDS </w:t>
-      </w:r>
-      <w:r>
-        <w:t>nativel</w:t>
-      </w:r>
-      <w:r>
-        <w:t>y</w:t>
-      </w:r>
-      <w:r>
-        <w:t xml:space="preserve"> produc</w:t>
-      </w:r>
-      <w:r>
-        <w:t>e</w:t>
-      </w:r>
-      <w:r>
-        <w:t>s sem</w:t>
-      </w:r>
-      <w:r>
-        <w:t>antic</w:t>
-      </w:r>
-      <w:r>
-        <w:t xml:space="preserve"> HTML</w:t>
-      </w:r>
-      <w:r>
-        <w:t xml:space="preserve"> </w:t>
-      </w:r>
-      <w:r>
-        <w:t>that are or</w:t>
-      </w:r>
-      <w:r>
-        <w:t>g</w:t>
-      </w:r>
-      <w:r>
-        <w:t xml:space="preserve">anized </w:t>
-      </w:r>
-      <w:r>
-        <w:t xml:space="preserve">as </w:t>
-      </w:r>
-      <w:r>
-        <w:t>content a</w:t>
-      </w:r>
-      <w:r>
-        <w:t>nd functi</w:t>
-      </w:r>
-      <w:r>
-        <w:t xml:space="preserve">onal </w:t>
-      </w:r>
-      <w:r>
-        <w:t>blocks</w:t>
-      </w:r>
-      <w:r>
-        <w:t xml:space="preserve">.  </w:t>
-      </w:r>
+      </w:r>
+      <w:r/>
+      <w:r/>
+      <w:r/>
+      <w:r/>
+      <w:r/>
+      <w:r/>
+      <w:r/>
+      <w:r/>
+      <w:r/>
+      <w:r/>
+      <w:r/>
+      <w:r/>
+      <w:r/>
+      <w:r/>
+      <w:r/>
+      <w:r/>
+      <w:r/>
+      <w:r/>
       <w:proofErr w:type="gramStart"/>
-      <w:r>
-        <w:t>In</w:t>
-      </w:r>
-      <w:r>
-        <w:t xml:space="preserve"> order</w:t>
-      </w:r>
-      <w:r>
-        <w:t xml:space="preserve"> </w:t>
-      </w:r>
-      <w:r>
-        <w:t>to</w:t>
-      </w:r>
+      <w:r/>
+      <w:r/>
+      <w:r/>
+      <w:r/>
       <w:proofErr w:type="gramEnd"/>
-      <w:r>
-        <w:t xml:space="preserve"> conform to those </w:t>
-      </w:r>
-      <w:r>
-        <w:t xml:space="preserve">Design Systems </w:t>
-      </w:r>
-      <w:r>
-        <w:t xml:space="preserve">artifacts and standards; </w:t>
-      </w:r>
-      <w:r>
-        <w:t>a de</w:t>
-      </w:r>
-      <w:r>
-        <w:t>termini</w:t>
-      </w:r>
-      <w:r>
-        <w:t xml:space="preserve">stic process needs to be implemented that extracts </w:t>
-      </w:r>
-      <w:r>
-        <w:t>HTML f</w:t>
-      </w:r>
-      <w:r>
-        <w:t xml:space="preserve">rom the Design System </w:t>
-      </w:r>
-      <w:r>
-        <w:t xml:space="preserve">into </w:t>
-      </w:r>
-      <w:r>
-        <w:t>“st</w:t>
-      </w:r>
-      <w:r>
-        <w:t xml:space="preserve">ub” files with </w:t>
-      </w:r>
-      <w:r>
-        <w:t>in</w:t>
-      </w:r>
-      <w:r>
-        <w:t xml:space="preserve">serted tokens for </w:t>
-      </w:r>
-      <w:r>
-        <w:t>content and then that</w:t>
-      </w:r>
-      <w:r>
-        <w:t xml:space="preserve"> HTML replaces by JavaS</w:t>
-      </w:r>
-      <w:r>
-        <w:t>cr</w:t>
-      </w:r>
-      <w:r>
-        <w:t xml:space="preserve">ipt at </w:t>
-      </w:r>
-      <w:r>
-        <w:t xml:space="preserve">time of </w:t>
-      </w:r>
-      <w:r>
-        <w:t>decoration.</w:t>
-      </w:r>
+      <w:r/>
+      <w:r/>
+      <w:r/>
+      <w:r/>
+      <w:r/>
+      <w:r/>
+      <w:r/>
+      <w:r/>
+      <w:r/>
+      <w:r/>
+      <w:r/>
+      <w:r/>
+      <w:r/>
+      <w:r/>
+      <w:r/>
+      <w:r/>
+      <w:r/>
+      <w:r/>
+      <w:r/>
     </w:p>
     <w:p>
       <w:pPr>
@@ -885,14 +1006,10 @@
         <w:spacing w:after="80"/>
       </w:pPr>
       <w:r>
-        <w:t xml:space="preserve">One design pattern produces exactly one implementation — the block owns the renderer, and Storybook </w:t>
-      </w:r>
-      <w:r>
-        <w:t>outputs a stub file</w:t>
-      </w:r>
-      <w:r>
-        <w:t>, so there is a single source of DOM and behavior, not two that can drift apart.</w:t>
-      </w:r>
+        <w:t>One design pattern produces exactly one implementation — the design system is extracted once into a stub file that the block renders from, so there is a single source of DOM and behavior, not two that can drift apart.</w:t>
+      </w:r>
+      <w:r/>
+      <w:r/>
     </w:p>
     <w:p>
       <w:pPr>
@@ -939,7 +1056,7 @@
         <w:rPr>
           <w:rFonts w:ascii="Courier New" w:eastAsia="Courier New" w:hAnsi="Courier New" w:cs="Courier New"/>
         </w:rPr>
-        <w:t>header</w:t>
+        <w:t>card</w:t>
       </w:r>
       <w:r>
         <w:t>). Full-library coverage and the automated CI gate are future-state work — see Section 3.</w:t>
@@ -1014,16 +1131,21 @@
         </w:rPr>
         <w:t>Design System conformance findings</w:t>
       </w:r>
-    </w:p>
-    <w:p>
-      <w:pPr>
-        <w:spacing w:after="160"/>
-      </w:pPr>
-      <w:r>
-        <w:br/>
-      </w:r>
-      <w:r>
-        <w:t>Storybook and EDS build things differently: a Storybook component just takes a JavaScript object of props, while an EDS block reads its content from an authored table that gets turned into real markup when the page loads. To stop those two from turning into two separate copies of the same design that quietly fall out of sync, we made one rule: the block writes the actual code that builds the markup, and the Storybook story just calls that same code. So there's only one version of the DOM, not a hand-copied second one sitting in Storybook.</w:t>
+      <w:proofErr w:type="gramStart"/>
+      <w:proofErr w:type="gramEnd"/>
+    </w:p>
+    <w:p>
+      <w:pPr>
+        <w:spacing w:before="0" w:after="160"/>
+      </w:pPr>
+      <w:r>
+        <w:t xml:space="preserve">Storybook and EDS build things differently: a Storybook component just takes a JavaScript object of props, while an EDS block reads its content from an authored table that gets turned into real markup when the page loads. To stop those two from turning into two separate copies of the same design that quietly fall out of sync, we made one rule: the block writes the actual code that builds the markup, and the Storybook story just calls that same code. </w:t>
+      </w:r>
+      <w:r>
+        <w:t>So</w:t>
+      </w:r>
+      <w:r>
+        <w:t xml:space="preserve"> there's only one version of the DOM, not a hand-copied second one sitting in Storybook.</w:t>
       </w:r>
     </w:p>
     <w:p>
@@ -1045,7 +1167,6 @@
           <w:bCs/>
           <w:color w:val="FA0F00"/>
         </w:rPr>
-        <w:lastRenderedPageBreak/>
         <w:t>Shared library and repository architecture learnings</w:t>
       </w:r>
     </w:p>
@@ -1155,15 +1276,15 @@
           <w:bCs/>
           <w:color w:val="FA0F00"/>
         </w:rPr>
-        <w:t>5. Case Study: Vessel Header Pattern → EDS Block Markup</w:t>
-      </w:r>
-    </w:p>
-    <w:p>
-      <w:pPr>
-        <w:spacing w:after="160"/>
-      </w:pPr>
-      <w:r>
-        <w:t>To make Section 2’s governance rule concrete — "the block owns the renderer, and the story imports it" — this section walks through exactly how one vessel pattern, the header, moves from KP’s raw design-system export into the code that ships with the EDS block.</w:t>
+        <w:t>4. Case Study: Vessel Card Pattern → EDS Block Markup</w:t>
+      </w:r>
+    </w:p>
+    <w:p>
+      <w:pPr>
+        <w:spacing w:after="160"/>
+      </w:pPr>
+      <w:r>
+        <w:t>To make Section 2’s governance rule concrete — "the block owns the renderer, and the story imports it" — this section walks through exactly how one vessel pattern, the card, moves from KP’s raw design-system export into the code that ships with the EDS block.</w:t>
       </w:r>
     </w:p>
     <w:p>
@@ -1185,7 +1306,7 @@
         <w:spacing w:after="160"/>
       </w:pPr>
       <w:r>
-        <w:t xml:space="preserve">The header’s design comes from a raw file in KP’s own design-system export: </w:t>
+        <w:t xml:space="preserve">The card’s design comes from a raw file in KP’s own design-system export: </w:t>
       </w:r>
       <w:r>
         <w:rPr>
@@ -1194,7 +1315,7 @@
         <w:t>design-files/kp-vessel-2/card-pattern/demo-basic-foundation-v3.html</w:t>
       </w:r>
       <w:r>
-        <w:t xml:space="preserve">. It’s a demo page KP’s design team built to show what the header should look like — not something that can be dropped straight into the site as-is. The only part that matters </w:t>
+        <w:t xml:space="preserve">. It’s a demo page KP’s design team built to show what the card should look like — not something that can be dropped straight into the site as-is. The only part that matters </w:t>
       </w:r>
       <w:proofErr w:type="gramStart"/>
       <w:r>
@@ -1208,7 +1329,7 @@
         <w:rPr>
           <w:rFonts w:ascii="Courier New" w:eastAsia="Courier New" w:hAnsi="Courier New" w:cs="Courier New"/>
         </w:rPr>
-        <w:t>&lt;header&gt;</w:t>
+        <w:t>&lt;div class="ds-card"&gt;</w:t>
       </w:r>
       <w:r>
         <w:t xml:space="preserve"> element inside it, shown below:</w:t>
@@ -1751,7 +1872,6 @@
           <w:sz w:val="15"/>
           <w:szCs w:val="15"/>
         </w:rPr>
-        <w:lastRenderedPageBreak/>
         <w:t xml:space="preserve">        &lt;button class="button -primary -light -small" data-analytics-type="button"</w:t>
       </w:r>
     </w:p>
@@ -1900,16 +2020,16 @@
         <w:spacing w:after="160"/>
       </w:pPr>
       <w:r>
-        <w:t xml:space="preserve">That header markup gets copied into a JS file — </w:t>
+        <w:t xml:space="preserve">That card markup gets copied into a JS file — </w:t>
       </w:r>
       <w:r>
         <w:rPr>
           <w:rFonts w:ascii="Courier New" w:eastAsia="Courier New" w:hAnsi="Courier New" w:cs="Courier New"/>
         </w:rPr>
-        <w:t>blocks/header/header-dom.js</w:t>
-      </w:r>
-      <w:r>
-        <w:t xml:space="preserve"> — that keeps the exact same shape, but swaps the hardcoded demo content (the logo, the menu label, the nav links) for placeholders, or </w:t>
+        <w:t>blocks/card/card-dom.js</w:t>
+      </w:r>
+      <w:r>
+        <w:t xml:space="preserve"> — that keeps the exact same shape, but swaps the hardcoded demo content (the eyebrow, title, subtitle, summary, and CTA) for placeholders, or </w:t>
       </w:r>
       <w:r>
         <w:rPr>
@@ -1919,7 +2039,7 @@
         <w:t>“tokens.”</w:t>
       </w:r>
       <w:r>
-        <w:t xml:space="preserve"> At runtime, real content coming from EDS — the page’s actual logo, nav links, and so on — gets dropped into those tokens. The result is the vessel’s exact markup, filled in with real content instead of demo content:</w:t>
+        <w:t xml:space="preserve"> At runtime, real content coming from EDS — the page’s actual heading, body copy, image, and link — gets dropped into those tokens. The result is the vessel’s exact markup, filled in with real content instead of demo content:</w:t>
       </w:r>
     </w:p>
     <w:p>
@@ -2065,6 +2185,7 @@
           <w:sz w:val="15"/>
           <w:szCs w:val="15"/>
         </w:rPr>
+        <w:lastRenderedPageBreak/>
         <w:t>}</w:t>
       </w:r>
       <w:r>
@@ -2084,7 +2205,7 @@
         <w:br/>
         <w:t xml:space="preserve">Full example - </w:t>
       </w:r>
-      <w:hyperlink r:id="rId5" w:history="1">
+      <w:hyperlink r:id="rId9" w:history="1">
         <w:r>
           <w:rPr>
             <w:rStyle w:val="Hyperlink"/>
@@ -2123,437 +2244,79 @@
       <w:pPr>
         <w:pStyle w:val="Heading2"/>
         <w:spacing w:before="280" w:after="120"/>
-      </w:pPr>
-      <w:r>
         <w:rPr>
           <w:b/>
           <w:bCs/>
           <w:color w:val="FA0F00"/>
         </w:rPr>
-        <w:t>Performance, SEO &amp; GEO considerations</w:t>
-      </w:r>
-    </w:p>
-    <w:p>
-      <w:pPr>
-        <w:spacing w:after="160"/>
-      </w:pPr>
-      <w:r>
-        <w:t>This token-fill pattern is convenient — it guarantees the header can never drift from the vessel design — but it has real tradeoffs worth naming, since the header appears on every page:</w:t>
-      </w:r>
-    </w:p>
-    <w:p>
-      <w:pPr>
-        <w:pStyle w:val="ListParagraph"/>
-        <w:numPr>
-          <w:ilvl w:val="0"/>
-          <w:numId w:val="2"/>
-        </w:numPr>
-        <w:spacing w:after="80"/>
       </w:pPr>
       <w:r>
         <w:rPr>
           <w:b/>
           <w:bCs/>
-        </w:rPr>
-        <w:t xml:space="preserve">Performance — layout shift is already handled, but by a second, uncoordinated layer: </w:t>
-      </w:r>
-      <w:r>
-        <w:t xml:space="preserve">EDS deliberately reserves the header’s space before any block JS runs — </w:t>
-      </w:r>
-      <w:r>
-        <w:rPr>
-          <w:rFonts w:ascii="Courier New" w:eastAsia="Courier New" w:hAnsi="Courier New" w:cs="Courier New"/>
-        </w:rPr>
-        <w:t>styles.css</w:t>
-      </w:r>
-      <w:r>
-        <w:t xml:space="preserve"> sets </w:t>
-      </w:r>
-      <w:r>
-        <w:rPr>
-          <w:rFonts w:ascii="Courier New" w:eastAsia="Courier New" w:hAnsi="Courier New" w:cs="Courier New"/>
-        </w:rPr>
-        <w:t>header { min-height: var(--header-height); }</w:t>
-      </w:r>
-      <w:r>
-        <w:t xml:space="preserve"> on the bare, undecorated </w:t>
-      </w:r>
-      <w:r>
-        <w:rPr>
-          <w:rFonts w:ascii="Courier New" w:eastAsia="Courier New" w:hAnsi="Courier New" w:cs="Courier New"/>
-        </w:rPr>
-        <w:t>&lt;header&gt;</w:t>
-      </w:r>
-      <w:r>
-        <w:t xml:space="preserve"> element, with </w:t>
-      </w:r>
-      <w:r>
-        <w:rPr>
-          <w:rFonts w:ascii="Courier New" w:eastAsia="Courier New" w:hAnsi="Courier New" w:cs="Courier New"/>
-        </w:rPr>
-        <w:t>--header-height</w:t>
-      </w:r>
-      <w:r>
-        <w:t xml:space="preserve"> set per breakpoint (80px mobile, 90px condensed desktop, 220px full desktop). The 220px value’s own code comment confirms this was fixed deliberately: </w:t>
-      </w:r>
-      <w:r>
-        <w:rPr>
-          <w:i/>
-          <w:iCs/>
-        </w:rPr>
-        <w:t>“the dominant CLS source on this page”</w:t>
-      </w:r>
-      <w:r>
-        <w:t xml:space="preserve"> was the header growing after load, before this reservation existed. </w:t>
+          <w:color w:val="FA0F00"/>
+        </w:rPr>
+        <w:t>Performance, SEO &amp; GEO considerations</w:t>
+      </w:r>
+    </w:p>
+    <w:p>
+      <w:pPr>
+        <w:spacing w:before="0" w:after="120"/>
+      </w:pPr>
+      <w:r>
+        <w:t xml:space="preserve">SEO &amp; GEO: not an issue, </w:t>
       </w:r>
       <w:proofErr w:type="gramStart"/>
       <w:r>
-        <w:t>So</w:t>
+        <w:t>as long as</w:t>
       </w:r>
       <w:proofErr w:type="gramEnd"/>
       <w:r>
-        <w:t xml:space="preserve"> the header’s box never resizes once the vessel-styled content lands inside it — that’s not layout shift by the Core Web Vitals definition.</w:t>
-      </w:r>
-    </w:p>
-    <w:p>
-      <w:pPr>
-        <w:pStyle w:val="ListParagraph"/>
-        <w:numPr>
-          <w:ilvl w:val="0"/>
-          <w:numId w:val="2"/>
-        </w:numPr>
-        <w:spacing w:after="80"/>
-      </w:pPr>
+        <w:t xml:space="preserve"> (1) all the real content exists in the hydrated HTML that EDS renders, and (2) the vessel/design-system layer only decorates that markup and CSS — it doesn't fetch or invent content of its own. Under those two conditions, any crawler — JS or no JS — ends up reading the same real content either way. Header is the one block that breaks both conditions: its shell is generic </w:t>
+      </w:r>
+      <w:proofErr w:type="spellStart"/>
+      <w:r>
+        <w:t>vendored</w:t>
+      </w:r>
+      <w:proofErr w:type="spellEnd"/>
+      <w:r>
+        <w:t xml:space="preserve"> markup, not hydrated per-page content, and its real nav comes from a separate fetch. That's why it's the exception, not the pattern.</w:t>
+      </w:r>
+    </w:p>
+    <w:p>
+      <w:pPr>
+        <w:spacing w:after="160"/>
+      </w:pPr>
+      <w:r>
+        <w:t>Keeping each block’s rendered output conformant to the vessel design system has to be a deterministic process, defined and locked down at the outset of a migration — a fixed pipeline (tokens derived from the vessel source, one shared renderer, a CI-gated parity diff) set up once by engineers and enforced mechanically on every change, not something rediscovered or hand-tuned page by page. It cannot be something the Experience Modernization Agent manages. An agent doing content migration has no way to know whether the block scaffolding it’s placing content into is design-system-conformant; it can only work within whatever scaffolding — and whatever token and conformance rules — already exist. That scaffolding has to be built, and its conformance enforced, before content migration begins, not discovered along the way. Conformance to the vessel system happens and can only be measured from within a browser’s executed JS rendering.</w:t>
+      </w:r>
       <w:r>
         <w:rPr>
           <w:b/>
           <w:bCs/>
         </w:rPr>
-        <w:t xml:space="preserve">But that fix only holds if the two layers stay in sync. </w:t>
-      </w:r>
-      <w:r>
-        <w:t xml:space="preserve">The 220px reservation was hand-tuned to match the </w:t>
-      </w:r>
-      <w:r>
-        <w:rPr>
-          <w:i/>
-          <w:iCs/>
-        </w:rPr>
-        <w:t>specific markup currently shipping</w:t>
-      </w:r>
-      <w:r>
-        <w:t xml:space="preserve"> — the older, larger </w:t>
-      </w:r>
-      <w:proofErr w:type="spellStart"/>
-      <w:r>
-        <w:t>vendored</w:t>
-      </w:r>
-      <w:proofErr w:type="spellEnd"/>
-      <w:r>
-        <w:t xml:space="preserve"> </w:t>
-      </w:r>
-      <w:proofErr w:type="spellStart"/>
-      <w:r>
-        <w:rPr>
-          <w:rFonts w:ascii="Courier New" w:eastAsia="Courier New" w:hAnsi="Courier New" w:cs="Courier New"/>
-        </w:rPr>
-        <w:t>kp</w:t>
-      </w:r>
-      <w:proofErr w:type="spellEnd"/>
-      <w:r>
-        <w:rPr>
-          <w:rFonts w:ascii="Courier New" w:eastAsia="Courier New" w:hAnsi="Courier New" w:cs="Courier New"/>
-        </w:rPr>
-        <w:t>-header</w:t>
-      </w:r>
-      <w:r>
-        <w:t xml:space="preserve"> pattern (full mega-menu, region/language pickers). It was not derived from, and is not linked to, the vessel’s own CSS or the newer </w:t>
-      </w:r>
-      <w:r>
-        <w:rPr>
-          <w:rFonts w:ascii="Courier New" w:eastAsia="Courier New" w:hAnsi="Courier New" w:cs="Courier New"/>
-        </w:rPr>
-        <w:t>ds-header</w:t>
-      </w:r>
-      <w:r>
-        <w:t xml:space="preserve"> compact pattern that </w:t>
-      </w:r>
-      <w:r>
-        <w:rPr>
-          <w:rFonts w:ascii="Courier New" w:eastAsia="Courier New" w:hAnsi="Courier New" w:cs="Courier New"/>
-        </w:rPr>
-        <w:t>header-dom.js</w:t>
-      </w:r>
-      <w:r>
-        <w:t xml:space="preserve"> now reproduces. In other words: a minimal design standard — the real, rendered height of the header at each breakpoint — has to be declared twice, in two different places that don’t reference each other: once on the plain semantic </w:t>
-      </w:r>
-      <w:r>
-        <w:rPr>
-          <w:rFonts w:ascii="Courier New" w:eastAsia="Courier New" w:hAnsi="Courier New" w:cs="Courier New"/>
-        </w:rPr>
-        <w:t>&lt;header&gt;</w:t>
-      </w:r>
-      <w:r>
-        <w:t xml:space="preserve"> tag (so the browser reserves the right space before any block exists), and again inside whichever block markup actually decorates into it (</w:t>
-      </w:r>
-      <w:proofErr w:type="spellStart"/>
-      <w:r>
-        <w:t>vendored</w:t>
-      </w:r>
-      <w:proofErr w:type="spellEnd"/>
-      <w:r>
-        <w:t xml:space="preserve"> </w:t>
-      </w:r>
-      <w:proofErr w:type="spellStart"/>
-      <w:r>
-        <w:rPr>
-          <w:rFonts w:ascii="Courier New" w:eastAsia="Courier New" w:hAnsi="Courier New" w:cs="Courier New"/>
-        </w:rPr>
-        <w:t>kp</w:t>
-      </w:r>
-      <w:proofErr w:type="spellEnd"/>
-      <w:r>
-        <w:rPr>
-          <w:rFonts w:ascii="Courier New" w:eastAsia="Courier New" w:hAnsi="Courier New" w:cs="Courier New"/>
-        </w:rPr>
-        <w:t>-header</w:t>
-      </w:r>
-      <w:r>
-        <w:t xml:space="preserve"> today, vessel </w:t>
-      </w:r>
-      <w:r>
-        <w:rPr>
-          <w:rFonts w:ascii="Courier New" w:eastAsia="Courier New" w:hAnsi="Courier New" w:cs="Courier New"/>
-        </w:rPr>
-        <w:t>ds-header</w:t>
-      </w:r>
-      <w:r>
-        <w:t xml:space="preserve"> once Section 5’s reconciliation lands). If the day comes that </w:t>
-      </w:r>
-      <w:proofErr w:type="spellStart"/>
+      </w:r>
+      <w:r/>
       <w:proofErr w:type="gramStart"/>
-      <w:r>
-        <w:rPr>
-          <w:rFonts w:ascii="Courier New" w:eastAsia="Courier New" w:hAnsi="Courier New" w:cs="Courier New"/>
-        </w:rPr>
-        <w:t>renderHeader</w:t>
-      </w:r>
-      <w:proofErr w:type="spellEnd"/>
-      <w:r>
-        <w:rPr>
-          <w:rFonts w:ascii="Courier New" w:eastAsia="Courier New" w:hAnsi="Courier New" w:cs="Courier New"/>
-        </w:rPr>
-        <w:t>(</w:t>
-      </w:r>
+      <w:r/>
+      <w:r/>
+      <w:r/>
       <w:proofErr w:type="gramEnd"/>
-      <w:r>
-        <w:rPr>
-          <w:rFonts w:ascii="Courier New" w:eastAsia="Courier New" w:hAnsi="Courier New" w:cs="Courier New"/>
-        </w:rPr>
-        <w:t>)</w:t>
-      </w:r>
-      <w:r>
-        <w:t xml:space="preserve"> replaces </w:t>
-      </w:r>
-      <w:r>
-        <w:rPr>
-          <w:rFonts w:ascii="Courier New" w:eastAsia="Courier New" w:hAnsi="Courier New" w:cs="Courier New"/>
-        </w:rPr>
-        <w:t>kp-markup.js</w:t>
-      </w:r>
-      <w:r>
-        <w:t xml:space="preserve"> as the block’s real output without also updating </w:t>
-      </w:r>
-      <w:r>
-        <w:rPr>
-          <w:rFonts w:ascii="Courier New" w:eastAsia="Courier New" w:hAnsi="Courier New" w:cs="Courier New"/>
-        </w:rPr>
-        <w:t>--header-height</w:t>
-      </w:r>
-      <w:r>
-        <w:t xml:space="preserve"> to match the shorter compact pattern, the exact CLS problem this reservation was built to solve comes back — just in the opposite direction (reserved space too </w:t>
-      </w:r>
-      <w:r>
-        <w:rPr>
-          <w:i/>
-          <w:iCs/>
-        </w:rPr>
-        <w:t>tall</w:t>
-      </w:r>
-      <w:r>
-        <w:t xml:space="preserve"> for the new, shorter header). The broader principle for any future block: a small set of sizing standards </w:t>
-      </w:r>
+      <w:r/>
       <w:proofErr w:type="gramStart"/>
-      <w:r>
-        <w:t>has to</w:t>
-      </w:r>
+      <w:r/>
       <w:proofErr w:type="gramEnd"/>
-      <w:r>
-        <w:t xml:space="preserve"> live on the native, undecorated semantic HTML that EDS renders </w:t>
-      </w:r>
+      <w:r/>
       <w:proofErr w:type="gramStart"/>
-      <w:r>
-        <w:t>first, and</w:t>
-      </w:r>
+      <w:r/>
       <w:proofErr w:type="gramEnd"/>
-      <w:r>
-        <w:t xml:space="preserve"> </w:t>
-      </w:r>
-      <w:proofErr w:type="gramStart"/>
-      <w:r>
-        <w:t>has to</w:t>
-      </w:r>
-      <w:proofErr w:type="gramEnd"/>
-      <w:r>
-        <w:t xml:space="preserve"> be kept in step with whatever vessel-conformant block eventually replaces it — one doesn’t automatically track the other.</w:t>
-      </w:r>
-    </w:p>
-    <w:p>
-      <w:pPr>
-        <w:pStyle w:val="ListParagraph"/>
-        <w:numPr>
-          <w:ilvl w:val="0"/>
-          <w:numId w:val="2"/>
-        </w:numPr>
-        <w:spacing w:after="80"/>
-      </w:pPr>
-      <w:r>
-        <w:rPr>
-          <w:b/>
-          <w:bCs/>
-        </w:rPr>
-        <w:t xml:space="preserve">SEO: </w:t>
-      </w:r>
-      <w:r>
-        <w:t xml:space="preserve">search engines generally do run JavaScript before indexing a page, but not instantly and not always completely. That’s a smaller, but real, risk that the header’s nav links — which help search engines understand how the site is </w:t>
-      </w:r>
-      <w:r>
-        <w:lastRenderedPageBreak/>
-        <w:t>structured — get picked up late or missed by a crawler that gives up early. Lower stakes than the sizing issue above, since the header is navigation chrome, not the content someone searched for.</w:t>
-      </w:r>
-    </w:p>
-    <w:p>
-      <w:pPr>
-        <w:pStyle w:val="ListParagraph"/>
-        <w:numPr>
-          <w:ilvl w:val="0"/>
-          <w:numId w:val="2"/>
-        </w:numPr>
-        <w:spacing w:after="80"/>
-      </w:pPr>
-      <w:r>
-        <w:rPr>
-          <w:b/>
-          <w:bCs/>
-        </w:rPr>
-        <w:t xml:space="preserve">GEO: </w:t>
-      </w:r>
-      <w:r>
-        <w:t xml:space="preserve">this is the bigger content concern. Many of the crawlers behind AI answer engines (the ones feeding tools like ChatGPT or Perplexity) don’t run JavaScript at all — they just read the raw HTML that comes back from the server. To them, a JavaScript-built header is invisible: no logo, no nav links, nothing. The team already solved this exact problem for real page content in Scenario 3 (Health Encyclopedia), which deliberately renders server-side at the edge </w:t>
-      </w:r>
-      <w:proofErr w:type="gramStart"/>
-      <w:r>
-        <w:t>specifically</w:t>
-      </w:r>
-      <w:proofErr w:type="gramEnd"/>
-      <w:r>
-        <w:t xml:space="preserve"> so the content is already in the raw HTML before it reaches the browser. The header hasn’t had that same treatment — reasonable, since a header’s nav links aren’t something an AI engine would cite — but worth flagging if this same token-fill pattern gets reused for something that </w:t>
-      </w:r>
-      <w:proofErr w:type="gramStart"/>
-      <w:r>
-        <w:t>actually is</w:t>
-      </w:r>
-      <w:proofErr w:type="gramEnd"/>
-      <w:r>
-        <w:t xml:space="preserve"> page content.</w:t>
-      </w:r>
-    </w:p>
-    <w:p>
-      <w:pPr>
-        <w:spacing w:after="160"/>
-      </w:pPr>
-      <w:r>
-        <w:t xml:space="preserve">The sizing/CLS coordination described above is a process requirement, not just a header-specific fix, and it has a direct bearing on how any future migration should be staffed. Keeping the native semantic HTML’s reserved sizing in step with the vessel block’s actual rendered output has to be a </w:t>
-      </w:r>
-      <w:r>
-        <w:rPr>
-          <w:b/>
-          <w:bCs/>
-        </w:rPr>
-        <w:t>deterministic process, defined and locked down at the outset</w:t>
-      </w:r>
-      <w:r>
-        <w:t xml:space="preserve"> of a migration — a fixed pipeline (tokens derived from the vessel source, one shared renderer, a CI-gated parity diff) set up once by engineers and enforced mechanically on every change, not something rediscovered or hand-tuned page by page. It cannot be something the Experience Modernization Agent manages, because that agent’s job is scoped to migrating </w:t>
-      </w:r>
-      <w:r>
-        <w:rPr>
-          <w:i/>
-          <w:iCs/>
-        </w:rPr>
-        <w:t>content</w:t>
-      </w:r>
-      <w:r>
-        <w:t xml:space="preserve"> — mapping a page’s existing text, links, and structure into the target block markup — not authoring or maintaining </w:t>
-      </w:r>
-      <w:r>
-        <w:rPr>
-          <w:i/>
-          <w:iCs/>
-        </w:rPr>
-        <w:t>styling</w:t>
-      </w:r>
-      <w:r>
-        <w:t xml:space="preserve">. An agent doing content migration has no way to know whether the block scaffolding </w:t>
-      </w:r>
-      <w:proofErr w:type="gramStart"/>
-      <w:r>
-        <w:t>it’s</w:t>
-      </w:r>
-      <w:proofErr w:type="gramEnd"/>
-      <w:r>
-        <w:t xml:space="preserve"> placing content into is CLS-safe or design-system-conformant; it can only work within whatever scaffolding — and whatever sizing/token rules — already exist. That scaffolding </w:t>
-      </w:r>
-      <w:proofErr w:type="gramStart"/>
-      <w:r>
-        <w:t>has to</w:t>
-      </w:r>
-      <w:proofErr w:type="gramEnd"/>
-      <w:r>
-        <w:t xml:space="preserve"> be built, and its conformance enforced, before content migration begins, not discovered along the way.</w:t>
-      </w:r>
-    </w:p>
-    <w:p>
-      <w:pPr>
-        <w:pBdr>
-          <w:bottom w:val="single" w:sz="6" w:space="0" w:color="CCCCCC"/>
-        </w:pBdr>
-        <w:spacing w:after="200"/>
-      </w:pPr>
+      <w:r/>
+      <w:r/>
     </w:p>
     <w:p>
       <w:pPr>
         <w:spacing w:after="60"/>
       </w:pPr>
-      <w:r>
-        <w:t>Full supporting detail, live URLs, and per-scenario checklists are maintained in the project’s living documentation (</w:t>
-      </w:r>
-      <w:r>
-        <w:rPr>
-          <w:rFonts w:ascii="Courier New" w:eastAsia="Courier New" w:hAnsi="Courier New" w:cs="Courier New"/>
-        </w:rPr>
-        <w:t>docs/index.html</w:t>
-      </w:r>
-      <w:r>
-        <w:t xml:space="preserve">) in the </w:t>
-      </w:r>
-      <w:proofErr w:type="spellStart"/>
-      <w:r>
-        <w:t>kp-hw</w:t>
-      </w:r>
-      <w:proofErr w:type="spellEnd"/>
-      <w:r>
-        <w:t xml:space="preserve"> repository.</w:t>
-      </w:r>
     </w:p>
     <w:sectPr>
       <w:pgSz w:w="12240" w:h="15840"/>
@@ -2568,6 +2331,119 @@
 <file path=word/numbering.xml><?xml version="1.0" encoding="utf-8"?>
 <w:numbering xmlns:wpc="http://schemas.microsoft.com/office/word/2010/wordprocessingCanvas" xmlns:cx="http://schemas.microsoft.com/office/drawing/2014/chartex" xmlns:cx1="http://schemas.microsoft.com/office/drawing/2015/9/8/chartex" xmlns:cx2="http://schemas.microsoft.com/office/drawing/2015/10/21/chartex" xmlns:cx3="http://schemas.microsoft.com/office/drawing/2016/5/9/chartex" xmlns:cx4="http://schemas.microsoft.com/office/drawing/2016/5/10/chartex" xmlns:cx5="http://schemas.microsoft.com/office/drawing/2016/5/11/chartex" xmlns:cx6="http://schemas.microsoft.com/office/drawing/2016/5/12/chartex" xmlns:cx7="http://schemas.microsoft.com/office/drawing/2016/5/13/chartex" xmlns:cx8="http://schemas.microsoft.com/office/drawing/2016/5/14/chartex" xmlns:mc="http://schemas.openxmlformats.org/markup-compatibility/2006" xmlns:m="http://schemas.openxmlformats.org/officeDocument/2006/math" xmlns:aink="http://schemas.microsoft.com/office/drawing/2016/ink" xmlns:am3d="http://schemas.microsoft.com/office/drawing/2017/model3d" xmlns:oel="http://schemas.microsoft.com/office/2019/extlst" xmlns:r="http://schemas.openxmlformats.org/officeDocument/2006/relationships" xmlns:wp14="http://schemas.microsoft.com/office/word/2010/wordprocessingDrawing" xmlns:wp="http://schemas.openxmlformats.org/drawingml/2006/wordprocessingDrawing" xmlns:wpg="http://schemas.microsoft.com/office/word/2010/wordprocessingGroup" xmlns:wpi="http://schemas.microsoft.com/office/word/2010/wordprocessingInk" xmlns:wps="http://schemas.microsoft.com/office/word/2010/wordprocessingShape" xmlns:o="urn:schemas-microsoft-com:office:office" xmlns:v="urn:schemas-microsoft-com:vml" xmlns:w10="urn:schemas-microsoft-com:office:word" xmlns:w="http://schemas.openxmlformats.org/wordprocessingml/2006/main" xmlns:w14="http://schemas.microsoft.com/office/word/2010/wordml" xmlns:w15="http://schemas.microsoft.com/office/word/2012/wordml" xmlns:w16cei="http://schemas.microsoft.com/office/word/2026/wordml/cei" xmlns:w16cex="http://schemas.microsoft.com/office/word/2018/wordml/cex" xmlns:w16cid="http://schemas.microsoft.com/office/word/2016/wordml/cid" xmlns:w16="http://schemas.microsoft.com/office/word/2018/wordml" xmlns:w16sdtdh="http://schemas.microsoft.com/office/word/2020/wordml/sdtdatahash" xmlns:w16sdtfl="http://schemas.microsoft.com/office/word/2024/wordml/sdtformatlock" xmlns:w16se="http://schemas.microsoft.com/office/word/2015/wordml/symex" xmlns:w16du="http://schemas.microsoft.com/office/word/2023/wordml/word16du" xmlns:wne="http://schemas.microsoft.com/office/word/2006/wordml" mc:Ignorable="w14 w15 w16se w16cid w16 w16cex w16sdtdh w16sdtfl w16du wp14">
   <w:abstractNum w:abstractNumId="0" w15:restartNumberingAfterBreak="0">
+    <w:nsid w:val="15813025"/>
+    <w:multiLevelType w:val="hybridMultilevel"/>
+    <w:tmpl w:val="88C8C408"/>
+    <w:lvl w:ilvl="0" w:tplc="04090001">
+      <w:start w:val="1"/>
+      <w:numFmt w:val="bullet"/>
+      <w:lvlText w:val=""/>
+      <w:lvlJc w:val="left"/>
+      <w:pPr>
+        <w:ind w:left="720" w:hanging="360"/>
+      </w:pPr>
+      <w:rPr>
+        <w:rFonts w:ascii="Symbol" w:hAnsi="Symbol" w:hint="default"/>
+      </w:rPr>
+    </w:lvl>
+    <w:lvl w:ilvl="1" w:tplc="04090003" w:tentative="1">
+      <w:start w:val="1"/>
+      <w:numFmt w:val="bullet"/>
+      <w:lvlText w:val="o"/>
+      <w:lvlJc w:val="left"/>
+      <w:pPr>
+        <w:ind w:left="1440" w:hanging="360"/>
+      </w:pPr>
+      <w:rPr>
+        <w:rFonts w:ascii="Courier New" w:hAnsi="Courier New" w:cs="Courier New" w:hint="default"/>
+      </w:rPr>
+    </w:lvl>
+    <w:lvl w:ilvl="2" w:tplc="04090005" w:tentative="1">
+      <w:start w:val="1"/>
+      <w:numFmt w:val="bullet"/>
+      <w:lvlText w:val=""/>
+      <w:lvlJc w:val="left"/>
+      <w:pPr>
+        <w:ind w:left="2160" w:hanging="360"/>
+      </w:pPr>
+      <w:rPr>
+        <w:rFonts w:ascii="Wingdings" w:hAnsi="Wingdings" w:hint="default"/>
+      </w:rPr>
+    </w:lvl>
+    <w:lvl w:ilvl="3" w:tplc="04090001" w:tentative="1">
+      <w:start w:val="1"/>
+      <w:numFmt w:val="bullet"/>
+      <w:lvlText w:val=""/>
+      <w:lvlJc w:val="left"/>
+      <w:pPr>
+        <w:ind w:left="2880" w:hanging="360"/>
+      </w:pPr>
+      <w:rPr>
+        <w:rFonts w:ascii="Symbol" w:hAnsi="Symbol" w:hint="default"/>
+      </w:rPr>
+    </w:lvl>
+    <w:lvl w:ilvl="4" w:tplc="04090003" w:tentative="1">
+      <w:start w:val="1"/>
+      <w:numFmt w:val="bullet"/>
+      <w:lvlText w:val="o"/>
+      <w:lvlJc w:val="left"/>
+      <w:pPr>
+        <w:ind w:left="3600" w:hanging="360"/>
+      </w:pPr>
+      <w:rPr>
+        <w:rFonts w:ascii="Courier New" w:hAnsi="Courier New" w:cs="Courier New" w:hint="default"/>
+      </w:rPr>
+    </w:lvl>
+    <w:lvl w:ilvl="5" w:tplc="04090005" w:tentative="1">
+      <w:start w:val="1"/>
+      <w:numFmt w:val="bullet"/>
+      <w:lvlText w:val=""/>
+      <w:lvlJc w:val="left"/>
+      <w:pPr>
+        <w:ind w:left="4320" w:hanging="360"/>
+      </w:pPr>
+      <w:rPr>
+        <w:rFonts w:ascii="Wingdings" w:hAnsi="Wingdings" w:hint="default"/>
+      </w:rPr>
+    </w:lvl>
+    <w:lvl w:ilvl="6" w:tplc="04090001" w:tentative="1">
+      <w:start w:val="1"/>
+      <w:numFmt w:val="bullet"/>
+      <w:lvlText w:val=""/>
+      <w:lvlJc w:val="left"/>
+      <w:pPr>
+        <w:ind w:left="5040" w:hanging="360"/>
+      </w:pPr>
+      <w:rPr>
+        <w:rFonts w:ascii="Symbol" w:hAnsi="Symbol" w:hint="default"/>
+      </w:rPr>
+    </w:lvl>
+    <w:lvl w:ilvl="7" w:tplc="04090003" w:tentative="1">
+      <w:start w:val="1"/>
+      <w:numFmt w:val="bullet"/>
+      <w:lvlText w:val="o"/>
+      <w:lvlJc w:val="left"/>
+      <w:pPr>
+        <w:ind w:left="5760" w:hanging="360"/>
+      </w:pPr>
+      <w:rPr>
+        <w:rFonts w:ascii="Courier New" w:hAnsi="Courier New" w:cs="Courier New" w:hint="default"/>
+      </w:rPr>
+    </w:lvl>
+    <w:lvl w:ilvl="8" w:tplc="04090005" w:tentative="1">
+      <w:start w:val="1"/>
+      <w:numFmt w:val="bullet"/>
+      <w:lvlText w:val=""/>
+      <w:lvlJc w:val="left"/>
+      <w:pPr>
+        <w:ind w:left="6480" w:hanging="360"/>
+      </w:pPr>
+      <w:rPr>
+        <w:rFonts w:ascii="Wingdings" w:hAnsi="Wingdings" w:hint="default"/>
+      </w:rPr>
+    </w:lvl>
+  </w:abstractNum>
+  <w:abstractNum w:abstractNumId="1" w15:restartNumberingAfterBreak="0">
     <w:nsid w:val="6E15795E"/>
     <w:multiLevelType w:val="hybridMultilevel"/>
     <w:tmpl w:val="C27A7632"/>
@@ -2625,7 +2501,120 @@
       <w:lvlJc w:val="left"/>
     </w:lvl>
   </w:abstractNum>
-  <w:abstractNum w:abstractNumId="1" w15:restartNumberingAfterBreak="0">
+  <w:abstractNum w:abstractNumId="2" w15:restartNumberingAfterBreak="0">
+    <w:nsid w:val="71A80A6B"/>
+    <w:multiLevelType w:val="hybridMultilevel"/>
+    <w:tmpl w:val="BA444B90"/>
+    <w:lvl w:ilvl="0" w:tplc="04090001">
+      <w:start w:val="1"/>
+      <w:numFmt w:val="bullet"/>
+      <w:lvlText w:val=""/>
+      <w:lvlJc w:val="left"/>
+      <w:pPr>
+        <w:ind w:left="720" w:hanging="360"/>
+      </w:pPr>
+      <w:rPr>
+        <w:rFonts w:ascii="Symbol" w:hAnsi="Symbol" w:hint="default"/>
+      </w:rPr>
+    </w:lvl>
+    <w:lvl w:ilvl="1" w:tplc="04090003" w:tentative="1">
+      <w:start w:val="1"/>
+      <w:numFmt w:val="bullet"/>
+      <w:lvlText w:val="o"/>
+      <w:lvlJc w:val="left"/>
+      <w:pPr>
+        <w:ind w:left="1440" w:hanging="360"/>
+      </w:pPr>
+      <w:rPr>
+        <w:rFonts w:ascii="Courier New" w:hAnsi="Courier New" w:cs="Courier New" w:hint="default"/>
+      </w:rPr>
+    </w:lvl>
+    <w:lvl w:ilvl="2" w:tplc="04090005" w:tentative="1">
+      <w:start w:val="1"/>
+      <w:numFmt w:val="bullet"/>
+      <w:lvlText w:val=""/>
+      <w:lvlJc w:val="left"/>
+      <w:pPr>
+        <w:ind w:left="2160" w:hanging="360"/>
+      </w:pPr>
+      <w:rPr>
+        <w:rFonts w:ascii="Wingdings" w:hAnsi="Wingdings" w:hint="default"/>
+      </w:rPr>
+    </w:lvl>
+    <w:lvl w:ilvl="3" w:tplc="04090001" w:tentative="1">
+      <w:start w:val="1"/>
+      <w:numFmt w:val="bullet"/>
+      <w:lvlText w:val=""/>
+      <w:lvlJc w:val="left"/>
+      <w:pPr>
+        <w:ind w:left="2880" w:hanging="360"/>
+      </w:pPr>
+      <w:rPr>
+        <w:rFonts w:ascii="Symbol" w:hAnsi="Symbol" w:hint="default"/>
+      </w:rPr>
+    </w:lvl>
+    <w:lvl w:ilvl="4" w:tplc="04090003" w:tentative="1">
+      <w:start w:val="1"/>
+      <w:numFmt w:val="bullet"/>
+      <w:lvlText w:val="o"/>
+      <w:lvlJc w:val="left"/>
+      <w:pPr>
+        <w:ind w:left="3600" w:hanging="360"/>
+      </w:pPr>
+      <w:rPr>
+        <w:rFonts w:ascii="Courier New" w:hAnsi="Courier New" w:cs="Courier New" w:hint="default"/>
+      </w:rPr>
+    </w:lvl>
+    <w:lvl w:ilvl="5" w:tplc="04090005" w:tentative="1">
+      <w:start w:val="1"/>
+      <w:numFmt w:val="bullet"/>
+      <w:lvlText w:val=""/>
+      <w:lvlJc w:val="left"/>
+      <w:pPr>
+        <w:ind w:left="4320" w:hanging="360"/>
+      </w:pPr>
+      <w:rPr>
+        <w:rFonts w:ascii="Wingdings" w:hAnsi="Wingdings" w:hint="default"/>
+      </w:rPr>
+    </w:lvl>
+    <w:lvl w:ilvl="6" w:tplc="04090001" w:tentative="1">
+      <w:start w:val="1"/>
+      <w:numFmt w:val="bullet"/>
+      <w:lvlText w:val=""/>
+      <w:lvlJc w:val="left"/>
+      <w:pPr>
+        <w:ind w:left="5040" w:hanging="360"/>
+      </w:pPr>
+      <w:rPr>
+        <w:rFonts w:ascii="Symbol" w:hAnsi="Symbol" w:hint="default"/>
+      </w:rPr>
+    </w:lvl>
+    <w:lvl w:ilvl="7" w:tplc="04090003" w:tentative="1">
+      <w:start w:val="1"/>
+      <w:numFmt w:val="bullet"/>
+      <w:lvlText w:val="o"/>
+      <w:lvlJc w:val="left"/>
+      <w:pPr>
+        <w:ind w:left="5760" w:hanging="360"/>
+      </w:pPr>
+      <w:rPr>
+        <w:rFonts w:ascii="Courier New" w:hAnsi="Courier New" w:cs="Courier New" w:hint="default"/>
+      </w:rPr>
+    </w:lvl>
+    <w:lvl w:ilvl="8" w:tplc="04090005" w:tentative="1">
+      <w:start w:val="1"/>
+      <w:numFmt w:val="bullet"/>
+      <w:lvlText w:val=""/>
+      <w:lvlJc w:val="left"/>
+      <w:pPr>
+        <w:ind w:left="6480" w:hanging="360"/>
+      </w:pPr>
+      <w:rPr>
+        <w:rFonts w:ascii="Wingdings" w:hAnsi="Wingdings" w:hint="default"/>
+      </w:rPr>
+    </w:lvl>
+  </w:abstractNum>
+  <w:abstractNum w:abstractNumId="3" w15:restartNumberingAfterBreak="0">
     <w:nsid w:val="7E751461"/>
     <w:multiLevelType w:val="hybridMultilevel"/>
     <w:tmpl w:val="0F3AA642"/>
@@ -2712,16 +2701,22 @@
     </w:lvl>
   </w:abstractNum>
   <w:num w:numId="1" w16cid:durableId="1631130241">
+    <w:abstractNumId w:val="3"/>
+    <w:lvlOverride w:ilvl="0">
+      <w:startOverride w:val="1"/>
+    </w:lvlOverride>
+  </w:num>
+  <w:num w:numId="2" w16cid:durableId="195850360">
     <w:abstractNumId w:val="1"/>
     <w:lvlOverride w:ilvl="0">
       <w:startOverride w:val="1"/>
     </w:lvlOverride>
   </w:num>
-  <w:num w:numId="2" w16cid:durableId="195850360">
+  <w:num w:numId="3" w16cid:durableId="2008945064">
     <w:abstractNumId w:val="0"/>
-    <w:lvlOverride w:ilvl="0">
-      <w:startOverride w:val="1"/>
-    </w:lvlOverride>
+  </w:num>
+  <w:num w:numId="4" w16cid:durableId="262687291">
+    <w:abstractNumId w:val="2"/>
   </w:num>
 </w:numbering>
 </file>

</xml_diff>

<commit_message>
docs: update KP feedback response with detailed scenario breakdowns
New version of the response document adding per-scenario detail (Health &
Wellness Landing, Health Class Directory, Health Encyclopedia, Diabetes
Landing) on top of the prior review-fixed content.

Co-Authored-By: Claude Opus 4.8 <noreply@anthropic.com>
</commit_message>
<xml_diff>
--- a/docs/KP-Migration-Framework-Feedback-Response.docx
+++ b/docs/KP-Migration-Framework-Feedback-Response.docx
@@ -1,6 +1,6 @@
 
 <file path=word/document.xml><?xml version="1.0" encoding="utf-8"?>
-<w:document xmlns:wpc="http://schemas.microsoft.com/office/word/2010/wordprocessingCanvas" xmlns:cx="http://schemas.microsoft.com/office/drawing/2014/chartex" xmlns:cx1="http://schemas.microsoft.com/office/drawing/2015/9/8/chartex" xmlns:cx2="http://schemas.microsoft.com/office/drawing/2015/10/21/chartex" xmlns:cx3="http://schemas.microsoft.com/office/drawing/2016/5/9/chartex" xmlns:cx4="http://schemas.microsoft.com/office/drawing/2016/5/10/chartex" xmlns:cx5="http://schemas.microsoft.com/office/drawing/2016/5/11/chartex" xmlns:cx6="http://schemas.microsoft.com/office/drawing/2016/5/12/chartex" xmlns:cx7="http://schemas.microsoft.com/office/drawing/2016/5/13/chartex" xmlns:cx8="http://schemas.microsoft.com/office/drawing/2016/5/14/chartex" xmlns:mc="http://schemas.openxmlformats.org/markup-compatibility/2006" xmlns:m="http://schemas.openxmlformats.org/officeDocument/2006/math" xmlns:aink="http://schemas.microsoft.com/office/drawing/2016/ink" xmlns:am3d="http://schemas.microsoft.com/office/drawing/2017/model3d" xmlns:oel="http://schemas.microsoft.com/office/2019/extlst" xmlns:r="http://schemas.openxmlformats.org/officeDocument/2006/relationships" xmlns:wp14="http://schemas.microsoft.com/office/word/2010/wordprocessingDrawing" xmlns:wp="http://schemas.openxmlformats.org/drawingml/2006/wordprocessingDrawing" xmlns:wpg="http://schemas.microsoft.com/office/word/2010/wordprocessingGroup" xmlns:wpi="http://schemas.microsoft.com/office/word/2010/wordprocessingInk" xmlns:wps="http://schemas.microsoft.com/office/word/2010/wordprocessingShape" xmlns:o="urn:schemas-microsoft-com:office:office" xmlns:v="urn:schemas-microsoft-com:vml" xmlns:w10="urn:schemas-microsoft-com:office:word" xmlns:w="http://schemas.openxmlformats.org/wordprocessingml/2006/main" xmlns:w14="http://schemas.microsoft.com/office/word/2010/wordml" xmlns:w15="http://schemas.microsoft.com/office/word/2012/wordml" xmlns:w16cei="http://schemas.microsoft.com/office/word/2026/wordml/cei" xmlns:w16cex="http://schemas.microsoft.com/office/word/2018/wordml/cex" xmlns:w16cid="http://schemas.microsoft.com/office/word/2016/wordml/cid" xmlns:w16="http://schemas.microsoft.com/office/word/2018/wordml" xmlns:w16sdtdh="http://schemas.microsoft.com/office/word/2020/wordml/sdtdatahash" xmlns:w16sdtfl="http://schemas.microsoft.com/office/word/2024/wordml/sdtformatlock" xmlns:w16se="http://schemas.microsoft.com/office/word/2015/wordml/symex" xmlns:w16du="http://schemas.microsoft.com/office/word/2023/wordml/word16du" xmlns:wne="http://schemas.microsoft.com/office/word/2006/wordml" mc:Ignorable="w14 w15 w16se w16cid w16 w16cex w16sdtdh w16sdtfl w16du wp14">
+<w:document xmlns:wpc="http://schemas.microsoft.com/office/word/2010/wordprocessingCanvas" xmlns:cx="http://schemas.microsoft.com/office/drawing/2014/chartex" xmlns:cx1="http://schemas.microsoft.com/office/drawing/2015/9/8/chartex" xmlns:cx2="http://schemas.microsoft.com/office/drawing/2015/10/21/chartex" xmlns:cx3="http://schemas.microsoft.com/office/drawing/2016/5/9/chartex" xmlns:cx4="http://schemas.microsoft.com/office/drawing/2016/5/10/chartex" xmlns:cx5="http://schemas.microsoft.com/office/drawing/2016/5/11/chartex" xmlns:cx6="http://schemas.microsoft.com/office/drawing/2016/5/12/chartex" xmlns:cx7="http://schemas.microsoft.com/office/drawing/2016/5/13/chartex" xmlns:cx8="http://schemas.microsoft.com/office/drawing/2016/5/14/chartex" xmlns:mc="http://schemas.openxmlformats.org/markup-compatibility/2006" xmlns:m="http://schemas.openxmlformats.org/officeDocument/2006/math" xmlns:aink="http://schemas.microsoft.com/office/drawing/2016/ink" xmlns:am3d="http://schemas.microsoft.com/office/drawing/2017/model3d" xmlns:oel="http://schemas.microsoft.com/office/2019/extlst" xmlns:r="http://schemas.openxmlformats.org/officeDocument/2006/relationships" xmlns:wp14="http://schemas.microsoft.com/office/word/2010/wordprocessingDrawing" xmlns:wp="http://schemas.openxmlformats.org/drawingml/2006/wordprocessingDrawing" xmlns:wpg="http://schemas.microsoft.com/office/word/2010/wordprocessingGroup" xmlns:wpi="http://schemas.microsoft.com/office/word/2010/wordprocessingInk" xmlns:wps="http://schemas.microsoft.com/office/word/2010/wordprocessingShape" xmlns:o="urn:schemas-microsoft-com:office:office" xmlns:v="urn:schemas-microsoft-com:vml" xmlns:w10="urn:schemas-microsoft-com:office:word" xmlns:w="http://schemas.openxmlformats.org/wordprocessingml/2006/main" xmlns:w14="http://schemas.microsoft.com/office/word/2010/wordml" xmlns:w15="http://schemas.microsoft.com/office/word/2012/wordml" xmlns:w16cex="http://schemas.microsoft.com/office/word/2018/wordml/cex" xmlns:w16cid="http://schemas.microsoft.com/office/word/2016/wordml/cid" xmlns:w16="http://schemas.microsoft.com/office/word/2018/wordml" xmlns:w16sdtdh="http://schemas.microsoft.com/office/word/2020/wordml/sdtdatahash" xmlns:w16sdtfl="http://schemas.microsoft.com/office/word/2024/wordml/sdtformatlock" xmlns:w16se="http://schemas.microsoft.com/office/word/2015/wordml/symex" xmlns:w16du="http://schemas.microsoft.com/office/word/2023/wordml/word16du" xmlns:wne="http://schemas.microsoft.com/office/word/2006/wordml" mc:Ignorable="w14 w15 w16se w16cid w16 w16cex w16sdtdh w16sdtfl w16du wp14">
   <w:body>
     <w:p>
       <w:pPr>
@@ -27,7 +27,7 @@
           <w:sz w:val="44"/>
           <w:szCs w:val="44"/>
         </w:rPr>
-        <w:t>Response to Migration Framework Review Feedback</w:t>
+        <w:t>KP POC and Design System</w:t>
       </w:r>
     </w:p>
     <w:p>
@@ -35,40 +35,8 @@
         <w:spacing w:after="160"/>
       </w:pPr>
       <w:r>
-        <w:rPr>
-          <w:i/>
-          <w:iCs/>
-          <w:color w:val="677083"/>
-        </w:rPr>
-        <w:t>Prepared in response to the four review points on the EDS modernization / migration framework document — each addressed below using the AEM Managed Services → Edge Delivery Services Health &amp; Wellness pilot as the evidentiary base.</w:t>
-      </w:r>
-    </w:p>
-    <w:p>
-      <w:pPr>
-        <w:pBdr>
-          <w:bottom w:val="single" w:sz="6" w:space="0" w:color="CCCCCC"/>
-        </w:pBdr>
-        <w:spacing w:after="200"/>
-      </w:pPr>
-    </w:p>
-    <w:p>
-      <w:pPr>
-        <w:spacing w:after="160"/>
-      </w:pPr>
-      <w:r>
         <w:t>This document answers, in order, the observations raised in the review of the migration framework. Supporting detail lives in the project’s GitHub codebase.</w:t>
       </w:r>
-      <w:r/>
-      <w:r/>
-      <w:proofErr w:type="gramStart"/>
-      <w:r/>
-      <w:proofErr w:type="gramEnd"/>
-      <w:r/>
-      <w:r/>
-      <w:proofErr w:type="spellStart"/>
-      <w:r/>
-      <w:proofErr w:type="spellEnd"/>
-      <w:r/>
     </w:p>
     <w:p>
       <w:pPr>
@@ -348,6 +316,9 @@
             <w:r>
               <w:t>storybook vessel files were implemented in card as an example of approach.</w:t>
             </w:r>
+            <w:r>
+              <w:br/>
+            </w:r>
           </w:p>
         </w:tc>
       </w:tr>
@@ -356,77 +327,44 @@
       <w:pPr>
         <w:pStyle w:val="Heading2"/>
         <w:spacing w:before="280" w:after="120"/>
-      </w:pPr>
-      <w:r>
         <w:rPr>
           <w:b/>
           <w:bCs/>
-          <w:color w:val="FA0F00"/>
-        </w:rPr>
-        <w:t>Architecture and repository patterns demonstrated</w:t>
-      </w:r>
-    </w:p>
-    <w:p>
-      <w:pPr>
-        <w:pStyle w:val="Heading3"/>
-        <w:spacing w:before="200" w:after="80"/>
+          <w:color w:val="000000" w:themeColor="text1"/>
+        </w:rPr>
+      </w:pPr>
+      <w:r>
         <w:rPr>
           <w:b/>
           <w:bCs/>
-        </w:rPr>
-      </w:pPr>
+          <w:color w:val="C00000"/>
+        </w:rPr>
+        <w:t>Scenario #1 - Health &amp; Wellness Landing Page</w:t>
+      </w:r>
       <w:r>
         <w:rPr>
           <w:b/>
           <w:bCs/>
-        </w:rPr>
-        <w:t>1. Repo</w:t>
+          <w:color w:val="C00000"/>
+        </w:rPr>
+        <w:br/>
       </w:r>
       <w:r>
         <w:rPr>
           <w:b/>
           <w:bCs/>
-        </w:rPr>
-        <w:t>-</w:t>
+          <w:color w:val="000000" w:themeColor="text1"/>
+        </w:rPr>
+        <w:br/>
+        <w:t>Approach A: Lucid Search API</w:t>
       </w:r>
       <w:r>
         <w:rPr>
           <w:b/>
           <w:bCs/>
-        </w:rPr>
-        <w:t>less Site Onboarding</w:t>
-      </w:r>
-    </w:p>
-    <w:p>
-      <w:pPr>
-        <w:spacing w:before="0" w:after="120"/>
-      </w:pPr>
-      <w:r>
-        <w:t xml:space="preserve">Rapidly provision KP Secondary Sale sites without a dedicated code repository per site using Adobe's </w:t>
-      </w:r>
-      <w:proofErr w:type="spellStart"/>
-      <w:r>
-        <w:t>repoless</w:t>
-      </w:r>
-      <w:proofErr w:type="spellEnd"/>
-      <w:r>
-        <w:t xml:space="preserve"> architecture.</w:t>
-      </w:r>
-    </w:p>
-    <w:p>
-      <w:pPr>
-        <w:spacing w:before="120" w:after="40"/>
-        <w:rPr>
-          <w:b/>
-          <w:bCs/>
-        </w:rPr>
-      </w:pPr>
-      <w:r>
-        <w:rPr>
-          <w:b/>
-          <w:bCs/>
-        </w:rPr>
-        <w:t>Key principles:</w:t>
+          <w:color w:val="000000" w:themeColor="text1"/>
+        </w:rPr>
+        <w:t xml:space="preserve">: </w:t>
       </w:r>
     </w:p>
     <w:p>
@@ -436,17 +374,32 @@
           <w:ilvl w:val="0"/>
           <w:numId w:val="2"/>
         </w:numPr>
-        <w:spacing w:before="0" w:after="80"/>
-      </w:pPr>
-      <w:r>
-        <w:t>Shared codebase, per-site content- One template repository (blocks, CSS/JS, PROJECT.md, block-mapping rules) is reused across every employer site. Site-specific copy, imagery, and CTAs are authored independently in each site's Document Authoring (DA) workspace.</w:t>
-      </w:r>
-      <w:proofErr w:type="spellStart"/>
-      <w:proofErr w:type="gramStart"/>
-      <w:r/>
-      <w:proofErr w:type="spellEnd"/>
-      <w:proofErr w:type="gramEnd"/>
-      <w:r/>
+        <w:spacing w:after="80"/>
+        <w:rPr>
+          <w:lang w:val="es-ES"/>
+        </w:rPr>
+      </w:pPr>
+      <w:r>
+        <w:rPr>
+          <w:lang w:val="es-ES"/>
+        </w:rPr>
+        <w:t xml:space="preserve">Demo: </w:t>
+      </w:r>
+      <w:hyperlink r:id="rId5" w:tgtFrame="_blank" w:history="1">
+        <w:r>
+          <w:rPr>
+            <w:rStyle w:val="normaltextrun"/>
+            <w:rFonts w:ascii="Calibri" w:hAnsi="Calibri" w:cs="Calibri"/>
+            <w:color w:val="0563C1"/>
+            <w:sz w:val="22"/>
+            <w:szCs w:val="22"/>
+            <w:u w:val="single"/>
+            <w:shd w:val="clear" w:color="auto" w:fill="FFFFFF"/>
+            <w:lang w:val="es-ES"/>
+          </w:rPr>
+          <w:t>https://kp.pbyb.live/northern-california/health-wellness</w:t>
+        </w:r>
+      </w:hyperlink>
     </w:p>
     <w:p>
       <w:pPr>
@@ -455,10 +408,42 @@
           <w:ilvl w:val="0"/>
           <w:numId w:val="2"/>
         </w:numPr>
-        <w:spacing w:before="0" w:after="80"/>
-      </w:pPr>
-      <w:r>
-        <w:t>Runtime composition- Edge Delivery Services composes the shared code with per-site DA content at request time, so a single fix or block enhancement propagates to all sites.</w:t>
+        <w:spacing w:after="80"/>
+      </w:pPr>
+      <w:r>
+        <w:rPr>
+          <w:color w:val="000000" w:themeColor="text1"/>
+        </w:rPr>
+        <w:t xml:space="preserve">Block code: </w:t>
+      </w:r>
+      <w:hyperlink r:id="rId6" w:history="1">
+        <w:r>
+          <w:rPr>
+            <w:rStyle w:val="Hyperlink"/>
+          </w:rPr>
+          <w:t>https://github.com/AdobeDrago/kp-hw/tree/main/blocks/related-articles-lucid</w:t>
+        </w:r>
+      </w:hyperlink>
+    </w:p>
+    <w:p>
+      <w:pPr>
+        <w:pStyle w:val="Heading2"/>
+        <w:spacing w:before="280" w:after="120"/>
+        <w:rPr>
+          <w:color w:val="000000" w:themeColor="text1"/>
+        </w:rPr>
+      </w:pPr>
+      <w:r>
+        <w:rPr>
+          <w:color w:val="000000" w:themeColor="text1"/>
+        </w:rPr>
+        <w:t>Approach B: Edge Delivery Services ‘Query Index’</w:t>
+      </w:r>
+      <w:r>
+        <w:rPr>
+          <w:color w:val="000000" w:themeColor="text1"/>
+        </w:rPr>
+        <w:t>:</w:t>
       </w:r>
     </w:p>
     <w:p>
@@ -468,11 +453,26 @@
           <w:ilvl w:val="0"/>
           <w:numId w:val="2"/>
         </w:numPr>
-        <w:spacing w:before="0" w:after="80"/>
-      </w:pPr>
-      <w:r>
-        <w:t>Agent-automated migration- The Experience Modernization Agent (EMA) scrapes the legacy source site and generates DA-ready HTML mapped to the shared block library, reducing migration to a content operation.</w:t>
-      </w:r>
+        <w:spacing w:after="80"/>
+        <w:rPr>
+          <w:lang w:val="es-ES"/>
+        </w:rPr>
+      </w:pPr>
+      <w:r>
+        <w:rPr>
+          <w:lang w:val="es-ES"/>
+        </w:rPr>
+        <w:t xml:space="preserve">Demo: </w:t>
+      </w:r>
+      <w:hyperlink r:id="rId7" w:history="1">
+        <w:r>
+          <w:rPr>
+            <w:rStyle w:val="Hyperlink"/>
+            <w:lang w:val="es-ES"/>
+          </w:rPr>
+          <w:t>https://kp.pbyb.live/northern-california/health-wellness-copy</w:t>
+        </w:r>
+      </w:hyperlink>
     </w:p>
     <w:p>
       <w:pPr>
@@ -481,7 +481,501 @@
           <w:ilvl w:val="0"/>
           <w:numId w:val="2"/>
         </w:numPr>
-        <w:spacing w:before="0" w:after="80"/>
+        <w:spacing w:after="80"/>
+      </w:pPr>
+      <w:r>
+        <w:rPr>
+          <w:color w:val="000000" w:themeColor="text1"/>
+        </w:rPr>
+        <w:t xml:space="preserve">Block code: </w:t>
+      </w:r>
+      <w:hyperlink r:id="rId8" w:history="1">
+        <w:r>
+          <w:rPr>
+            <w:rStyle w:val="Hyperlink"/>
+          </w:rPr>
+          <w:t>https://github.com/AdobeDrago/kp-hw/tree/main/blocks/related-articles</w:t>
+        </w:r>
+      </w:hyperlink>
+    </w:p>
+    <w:p>
+      <w:pPr>
+        <w:pStyle w:val="Heading2"/>
+        <w:spacing w:before="280" w:after="120"/>
+        <w:rPr>
+          <w:color w:val="000000" w:themeColor="text1"/>
+        </w:rPr>
+      </w:pPr>
+    </w:p>
+    <w:p>
+      <w:pPr>
+        <w:pStyle w:val="Heading2"/>
+        <w:spacing w:before="280" w:after="120"/>
+        <w:rPr>
+          <w:b/>
+          <w:bCs/>
+          <w:color w:val="C00000"/>
+        </w:rPr>
+      </w:pPr>
+      <w:r>
+        <w:rPr>
+          <w:b/>
+          <w:bCs/>
+          <w:color w:val="C00000"/>
+        </w:rPr>
+        <w:t>Scenario #2 - Health Class Directory</w:t>
+      </w:r>
+      <w:r>
+        <w:rPr>
+          <w:b/>
+          <w:bCs/>
+          <w:color w:val="C00000"/>
+        </w:rPr>
+        <w:t xml:space="preserve"> (Search and result pages)</w:t>
+      </w:r>
+    </w:p>
+    <w:p>
+      <w:pPr>
+        <w:pStyle w:val="ListParagraph"/>
+        <w:numPr>
+          <w:ilvl w:val="0"/>
+          <w:numId w:val="2"/>
+        </w:numPr>
+        <w:spacing w:after="80"/>
+        <w:rPr>
+          <w:lang w:val="es-ES"/>
+        </w:rPr>
+      </w:pPr>
+      <w:r>
+        <w:rPr>
+          <w:lang w:val="es-ES"/>
+        </w:rPr>
+        <w:t>Demo:</w:t>
+      </w:r>
+      <w:r>
+        <w:rPr>
+          <w:lang w:val="es-ES"/>
+        </w:rPr>
+        <w:br/>
+        <w:t xml:space="preserve">- </w:t>
+      </w:r>
+      <w:hyperlink r:id="rId9" w:history="1">
+        <w:r>
+          <w:rPr>
+            <w:rStyle w:val="Hyperlink"/>
+            <w:lang w:val="es-ES"/>
+          </w:rPr>
+          <w:t>https://kp.pbyb.live/northern-california/health-wellness/classes-programs/</w:t>
+        </w:r>
+      </w:hyperlink>
+      <w:r>
+        <w:rPr>
+          <w:lang w:val="es-ES"/>
+        </w:rPr>
+        <w:br/>
+        <w:t>-</w:t>
+      </w:r>
+      <w:r>
+        <w:rPr>
+          <w:lang w:val="es-ES"/>
+        </w:rPr>
+        <w:t xml:space="preserve"> </w:t>
+      </w:r>
+      <w:hyperlink r:id="rId10" w:tgtFrame="_blank" w:history="1">
+        <w:r>
+          <w:rPr>
+            <w:rStyle w:val="normaltextrun"/>
+            <w:rFonts w:ascii="Calibri" w:hAnsi="Calibri" w:cs="Calibri"/>
+            <w:color w:val="0563C1"/>
+            <w:sz w:val="22"/>
+            <w:szCs w:val="22"/>
+            <w:u w:val="single"/>
+            <w:shd w:val="clear" w:color="auto" w:fill="FFFFFF"/>
+            <w:lang w:val="es-ES"/>
+          </w:rPr>
+          <w:t>https://kp.pbyb.live/northern-california/health-wellness/classes-programs/search-results?user_zip=&amp;health_topic=Healthy%20eating</w:t>
+        </w:r>
+      </w:hyperlink>
+      <w:r>
+        <w:rPr>
+          <w:rStyle w:val="eop"/>
+          <w:rFonts w:ascii="Calibri" w:hAnsi="Calibri" w:cs="Calibri"/>
+          <w:color w:val="000000"/>
+          <w:sz w:val="22"/>
+          <w:szCs w:val="22"/>
+          <w:bdr w:val="none" w:sz="0" w:space="0" w:color="auto" w:frame="1"/>
+          <w:shd w:val="clear" w:color="auto" w:fill="606060"/>
+          <w:lang w:val="es-ES"/>
+        </w:rPr>
+        <w:t> </w:t>
+      </w:r>
+    </w:p>
+    <w:p>
+      <w:pPr>
+        <w:pStyle w:val="ListParagraph"/>
+        <w:numPr>
+          <w:ilvl w:val="0"/>
+          <w:numId w:val="2"/>
+        </w:numPr>
+        <w:spacing w:after="80"/>
+      </w:pPr>
+      <w:r>
+        <w:rPr>
+          <w:color w:val="000000" w:themeColor="text1"/>
+        </w:rPr>
+        <w:t>Block code:</w:t>
+      </w:r>
+      <w:r>
+        <w:rPr>
+          <w:color w:val="000000" w:themeColor="text1"/>
+        </w:rPr>
+        <w:br/>
+        <w:t xml:space="preserve">- </w:t>
+      </w:r>
+      <w:hyperlink r:id="rId11" w:history="1">
+        <w:r>
+          <w:rPr>
+            <w:rStyle w:val="Hyperlink"/>
+          </w:rPr>
+          <w:t>https://github.com/AdobeDrago/kp-hw/tree/main/blocks/classes-search</w:t>
+        </w:r>
+      </w:hyperlink>
+      <w:r>
+        <w:rPr>
+          <w:color w:val="000000" w:themeColor="text1"/>
+        </w:rPr>
+        <w:br/>
+        <w:t xml:space="preserve">- </w:t>
+      </w:r>
+      <w:hyperlink r:id="rId12" w:history="1">
+        <w:r>
+          <w:rPr>
+            <w:rStyle w:val="Hyperlink"/>
+          </w:rPr>
+          <w:t>https://github.com/AdobeDrago/kp-hw/tree/main/blocks/classes-results</w:t>
+        </w:r>
+      </w:hyperlink>
+    </w:p>
+    <w:p>
+      <w:pPr>
+        <w:pStyle w:val="Heading2"/>
+        <w:spacing w:before="280" w:after="120"/>
+        <w:rPr>
+          <w:b/>
+          <w:bCs/>
+          <w:color w:val="C00000"/>
+        </w:rPr>
+      </w:pPr>
+      <w:r>
+        <w:rPr>
+          <w:b/>
+          <w:bCs/>
+          <w:color w:val="C00000"/>
+        </w:rPr>
+        <w:t>Scenario #3 – Health Encyclopedia</w:t>
+      </w:r>
+    </w:p>
+    <w:p>
+      <w:pPr>
+        <w:pStyle w:val="ListParagraph"/>
+        <w:numPr>
+          <w:ilvl w:val="0"/>
+          <w:numId w:val="2"/>
+        </w:numPr>
+        <w:spacing w:after="80"/>
+        <w:rPr>
+          <w:lang w:val="es-ES"/>
+        </w:rPr>
+      </w:pPr>
+      <w:r>
+        <w:rPr>
+          <w:lang w:val="es-ES"/>
+        </w:rPr>
+        <w:t xml:space="preserve">Demo: </w:t>
+      </w:r>
+      <w:hyperlink r:id="rId13" w:tgtFrame="_blank" w:history="1">
+        <w:r>
+          <w:rPr>
+            <w:rStyle w:val="normaltextrun"/>
+            <w:rFonts w:ascii="Calibri" w:hAnsi="Calibri" w:cs="Calibri"/>
+            <w:color w:val="0563C1"/>
+            <w:sz w:val="22"/>
+            <w:szCs w:val="22"/>
+            <w:u w:val="single"/>
+            <w:shd w:val="clear" w:color="auto" w:fill="FFFFFF"/>
+            <w:lang w:val="es-ES"/>
+          </w:rPr>
+          <w:t>https://kp.pbyb.live/northern-california/health-wellness/health-encyclopedia/article/acn8821</w:t>
+        </w:r>
+      </w:hyperlink>
+      <w:r>
+        <w:rPr>
+          <w:rStyle w:val="eop"/>
+          <w:rFonts w:ascii="Calibri" w:hAnsi="Calibri" w:cs="Calibri"/>
+          <w:color w:val="000000"/>
+          <w:sz w:val="22"/>
+          <w:szCs w:val="22"/>
+          <w:bdr w:val="none" w:sz="0" w:space="0" w:color="auto" w:frame="1"/>
+          <w:shd w:val="clear" w:color="auto" w:fill="606060"/>
+          <w:lang w:val="es-ES"/>
+        </w:rPr>
+        <w:t> </w:t>
+      </w:r>
+    </w:p>
+    <w:p>
+      <w:pPr>
+        <w:pStyle w:val="ListParagraph"/>
+        <w:numPr>
+          <w:ilvl w:val="0"/>
+          <w:numId w:val="2"/>
+        </w:numPr>
+        <w:spacing w:after="80"/>
+      </w:pPr>
+      <w:r>
+        <w:rPr>
+          <w:color w:val="000000" w:themeColor="text1"/>
+        </w:rPr>
+        <w:lastRenderedPageBreak/>
+        <w:t>C</w:t>
+      </w:r>
+      <w:r>
+        <w:rPr>
+          <w:color w:val="000000" w:themeColor="text1"/>
+        </w:rPr>
+        <w:t xml:space="preserve">ode: </w:t>
+      </w:r>
+      <w:hyperlink r:id="rId14" w:history="1">
+        <w:r>
+          <w:rPr>
+            <w:rStyle w:val="Hyperlink"/>
+          </w:rPr>
+          <w:t>https://github.com/AdobeDrago/kp-hw/tree/main/aem-edge-functions</w:t>
+        </w:r>
+      </w:hyperlink>
+      <w:r>
+        <w:rPr>
+          <w:color w:val="000000" w:themeColor="text1"/>
+        </w:rPr>
+        <w:br/>
+      </w:r>
+    </w:p>
+    <w:p>
+      <w:pPr>
+        <w:pStyle w:val="Heading2"/>
+        <w:spacing w:before="280" w:after="120"/>
+        <w:rPr>
+          <w:b/>
+          <w:bCs/>
+          <w:color w:val="C00000"/>
+        </w:rPr>
+      </w:pPr>
+      <w:r>
+        <w:rPr>
+          <w:b/>
+          <w:bCs/>
+          <w:color w:val="C00000"/>
+        </w:rPr>
+        <w:t>Scenario #4 – Diabetes Landing Page</w:t>
+      </w:r>
+    </w:p>
+    <w:p>
+      <w:pPr>
+        <w:pStyle w:val="ListParagraph"/>
+        <w:numPr>
+          <w:ilvl w:val="0"/>
+          <w:numId w:val="2"/>
+        </w:numPr>
+        <w:spacing w:after="80"/>
+        <w:rPr>
+          <w:rStyle w:val="eop"/>
+          <w:lang w:val="es-ES"/>
+        </w:rPr>
+      </w:pPr>
+      <w:r>
+        <w:rPr>
+          <w:lang w:val="es-ES"/>
+        </w:rPr>
+        <w:t xml:space="preserve">Demo: </w:t>
+      </w:r>
+      <w:hyperlink r:id="rId15" w:tgtFrame="_blank" w:history="1">
+        <w:r>
+          <w:rPr>
+            <w:rStyle w:val="normaltextrun"/>
+            <w:rFonts w:ascii="Calibri" w:hAnsi="Calibri" w:cs="Calibri"/>
+            <w:color w:val="0563C1"/>
+            <w:sz w:val="22"/>
+            <w:szCs w:val="22"/>
+            <w:u w:val="single"/>
+            <w:shd w:val="clear" w:color="auto" w:fill="FFFFFF"/>
+            <w:lang w:val="es-ES"/>
+          </w:rPr>
+          <w:t>https://kp.pbyb.live/northern-california/health-wellness/diabetes</w:t>
+        </w:r>
+      </w:hyperlink>
+      <w:r>
+        <w:rPr>
+          <w:rStyle w:val="eop"/>
+          <w:rFonts w:ascii="Calibri" w:hAnsi="Calibri" w:cs="Calibri"/>
+          <w:color w:val="000000"/>
+          <w:sz w:val="22"/>
+          <w:szCs w:val="22"/>
+          <w:bdr w:val="none" w:sz="0" w:space="0" w:color="auto" w:frame="1"/>
+          <w:shd w:val="clear" w:color="auto" w:fill="606060"/>
+          <w:lang w:val="es-ES"/>
+        </w:rPr>
+        <w:t> </w:t>
+      </w:r>
+    </w:p>
+    <w:p>
+      <w:pPr>
+        <w:pStyle w:val="ListParagraph"/>
+        <w:numPr>
+          <w:ilvl w:val="0"/>
+          <w:numId w:val="2"/>
+        </w:numPr>
+        <w:spacing w:after="80"/>
+      </w:pPr>
+      <w:r>
+        <w:rPr>
+          <w:color w:val="000000" w:themeColor="text1"/>
+        </w:rPr>
+        <w:t xml:space="preserve">Code: </w:t>
+      </w:r>
+      <w:hyperlink r:id="rId16" w:history="1">
+        <w:r>
+          <w:rPr>
+            <w:rStyle w:val="Hyperlink"/>
+          </w:rPr>
+          <w:t>https://github.com/AdobeDrago/kp-hw/tree/main/blocks/article-collection</w:t>
+        </w:r>
+      </w:hyperlink>
+    </w:p>
+    <w:p>
+      <w:pPr>
+        <w:pStyle w:val="Heading2"/>
+        <w:spacing w:before="280" w:after="120"/>
+      </w:pPr>
+      <w:r>
+        <w:rPr>
+          <w:b/>
+          <w:bCs/>
+          <w:color w:val="FA0F00"/>
+        </w:rPr>
+        <w:br/>
+      </w:r>
+      <w:r>
+        <w:rPr>
+          <w:b/>
+          <w:bCs/>
+          <w:color w:val="FA0F00"/>
+        </w:rPr>
+        <w:br/>
+      </w:r>
+      <w:r>
+        <w:rPr>
+          <w:b/>
+          <w:bCs/>
+          <w:color w:val="FA0F00"/>
+        </w:rPr>
+        <w:t>Architecture and repository patterns demonstrated</w:t>
+      </w:r>
+    </w:p>
+    <w:p>
+      <w:pPr>
+        <w:pStyle w:val="Heading3"/>
+        <w:spacing w:before="200" w:after="80"/>
+        <w:rPr>
+          <w:b/>
+          <w:bCs/>
+        </w:rPr>
+      </w:pPr>
+      <w:r>
+        <w:rPr>
+          <w:b/>
+          <w:bCs/>
+        </w:rPr>
+        <w:t>1. Repo-less Site Onboarding</w:t>
+      </w:r>
+    </w:p>
+    <w:p>
+      <w:pPr>
+        <w:spacing w:after="120"/>
+      </w:pPr>
+      <w:r>
+        <w:t xml:space="preserve">Rapidly provision KP Secondary Sale sites without a dedicated code repository per site using Adobe's </w:t>
+      </w:r>
+      <w:proofErr w:type="spellStart"/>
+      <w:r>
+        <w:t>repoless</w:t>
+      </w:r>
+      <w:proofErr w:type="spellEnd"/>
+      <w:r>
+        <w:t xml:space="preserve"> architecture.</w:t>
+      </w:r>
+    </w:p>
+    <w:p>
+      <w:pPr>
+        <w:spacing w:before="120" w:after="40"/>
+        <w:rPr>
+          <w:b/>
+          <w:bCs/>
+        </w:rPr>
+      </w:pPr>
+      <w:r>
+        <w:rPr>
+          <w:b/>
+          <w:bCs/>
+        </w:rPr>
+        <w:t>Key principles:</w:t>
+      </w:r>
+    </w:p>
+    <w:p>
+      <w:pPr>
+        <w:pStyle w:val="ListParagraph"/>
+        <w:numPr>
+          <w:ilvl w:val="0"/>
+          <w:numId w:val="2"/>
+        </w:numPr>
+        <w:spacing w:after="80"/>
+      </w:pPr>
+      <w:r>
+        <w:t>Shared codebase, per-site content- One template repository (blocks, CSS/JS, PROJECT.md, block-mapping rules) is reused across every employer site. Site-specific copy, imagery, and CTAs are authored independently in each site's Document Authoring (DA) workspace.</w:t>
+      </w:r>
+    </w:p>
+    <w:p>
+      <w:pPr>
+        <w:pStyle w:val="ListParagraph"/>
+        <w:numPr>
+          <w:ilvl w:val="0"/>
+          <w:numId w:val="2"/>
+        </w:numPr>
+        <w:spacing w:after="80"/>
+      </w:pPr>
+      <w:r>
+        <w:t>Runtime composition- Edge Delivery Services composes the shared code with per-site DA content at request time, so a single fix or block enhancement propagates to all sites.</w:t>
+      </w:r>
+    </w:p>
+    <w:p>
+      <w:pPr>
+        <w:pStyle w:val="ListParagraph"/>
+        <w:numPr>
+          <w:ilvl w:val="0"/>
+          <w:numId w:val="2"/>
+        </w:numPr>
+        <w:spacing w:after="80"/>
+      </w:pPr>
+      <w:r>
+        <w:t>Agent-automated migration- The Experience Modernization Agent (EMA) scrapes the legacy source site and generates DA-ready HTML mapped to the shared block library, reducing migration to a content operation.</w:t>
+      </w:r>
+    </w:p>
+    <w:p>
+      <w:pPr>
+        <w:pStyle w:val="ListParagraph"/>
+        <w:numPr>
+          <w:ilvl w:val="0"/>
+          <w:numId w:val="2"/>
+        </w:numPr>
+        <w:spacing w:after="80"/>
       </w:pPr>
       <w:r>
         <w:t>Repo-per-site as an escalation path- Dedicated repositories remain an advanced enterprise option for sites needing custom code or independent build/deploy pipelines.</w:t>
@@ -489,12 +983,12 @@
     </w:p>
     <w:p>
       <w:pPr>
-        <w:spacing w:before="0" w:after="120"/>
+        <w:spacing w:after="120"/>
       </w:pPr>
       <w:r>
         <w:t xml:space="preserve">Reference: </w:t>
       </w:r>
-      <w:hyperlink r:id="rId5" w:history="1">
+      <w:hyperlink r:id="rId17" w:history="1">
         <w:r>
           <w:rPr>
             <w:rStyle w:val="Hyperlink"/>
@@ -505,10 +999,9 @@
     </w:p>
     <w:p>
       <w:pPr>
-        <w:spacing w:before="0" w:after="120"/>
-      </w:pPr>
-      <w:r>
-        <w:lastRenderedPageBreak/>
+        <w:spacing w:after="120"/>
+      </w:pPr>
+      <w:r>
         <w:t>Showcased 6/3/2026 (onsite meeting)</w:t>
       </w:r>
     </w:p>
@@ -531,7 +1024,7 @@
     </w:p>
     <w:p>
       <w:pPr>
-        <w:spacing w:before="0" w:after="120"/>
+        <w:spacing w:after="120"/>
       </w:pPr>
       <w:r>
         <w:t>Move all reusable pieces - blocks, shared styles, and global code - into one central library that any KP site can pull from, instead of each site keeping its own copy. This establishes a single source of truth for blocks and styling, currently proven on a working branch as the path toward a fully versioned global library.</w:t>
@@ -560,7 +1053,7 @@
           <w:ilvl w:val="0"/>
           <w:numId w:val="2"/>
         </w:numPr>
-        <w:spacing w:before="0" w:after="80"/>
+        <w:spacing w:after="80"/>
       </w:pPr>
       <w:r>
         <w:t>Less duplication- One copy of each component and style, rather than the same code repeated across every site.</w:t>
@@ -573,7 +1066,7 @@
           <w:ilvl w:val="0"/>
           <w:numId w:val="2"/>
         </w:numPr>
-        <w:spacing w:before="0" w:after="80"/>
+        <w:spacing w:after="80"/>
       </w:pPr>
       <w:r>
         <w:t>Consistency by default- Every site draws from the same library, keeping branding and behavior uniform across properties.</w:t>
@@ -586,7 +1079,7 @@
           <w:ilvl w:val="0"/>
           <w:numId w:val="2"/>
         </w:numPr>
-        <w:spacing w:before="0" w:after="80"/>
+        <w:spacing w:after="80"/>
       </w:pPr>
       <w:r>
         <w:t>Faster rollouts- A fix or design change made once flows out to all sites automatically, with no per-site updates.</w:t>
@@ -599,7 +1092,7 @@
           <w:ilvl w:val="0"/>
           <w:numId w:val="2"/>
         </w:numPr>
-        <w:spacing w:before="0" w:after="80"/>
+        <w:spacing w:after="80"/>
       </w:pPr>
       <w:r>
         <w:t>Easier maintenance- A single source of truth to test, patch, and govern, lowering long-term upkeep and risk.</w:t>
@@ -612,7 +1105,7 @@
           <w:ilvl w:val="0"/>
           <w:numId w:val="2"/>
         </w:numPr>
-        <w:spacing w:before="0" w:after="80"/>
+        <w:spacing w:after="80"/>
       </w:pPr>
       <w:r>
         <w:t xml:space="preserve">Faster site launches- </w:t>
@@ -644,7 +1137,7 @@
           <w:ilvl w:val="0"/>
           <w:numId w:val="2"/>
         </w:numPr>
-        <w:spacing w:before="0" w:after="80"/>
+        <w:spacing w:after="80"/>
       </w:pPr>
       <w:r>
         <w:t>Libs folder -</w:t>
@@ -652,7 +1145,7 @@
       <w:r>
         <w:t xml:space="preserve"> </w:t>
       </w:r>
-      <w:hyperlink r:id="rId6" w:history="1">
+      <w:hyperlink r:id="rId18" w:history="1">
         <w:r>
           <w:rPr>
             <w:rStyle w:val="Hyperlink"/>
@@ -668,7 +1161,7 @@
           <w:ilvl w:val="0"/>
           <w:numId w:val="2"/>
         </w:numPr>
-        <w:spacing w:before="0" w:after="80"/>
+        <w:spacing w:after="80"/>
       </w:pPr>
       <w:r>
         <w:t>Main -</w:t>
@@ -676,7 +1169,7 @@
       <w:r>
         <w:t xml:space="preserve"> </w:t>
       </w:r>
-      <w:hyperlink r:id="rId7" w:history="1">
+      <w:hyperlink r:id="rId19" w:history="1">
         <w:r>
           <w:rPr>
             <w:rStyle w:val="Hyperlink"/>
@@ -692,7 +1185,7 @@
           <w:ilvl w:val="0"/>
           <w:numId w:val="2"/>
         </w:numPr>
-        <w:spacing w:before="0" w:after="80"/>
+        <w:spacing w:after="80"/>
       </w:pPr>
       <w:r>
         <w:t>Site B -</w:t>
@@ -700,7 +1193,7 @@
       <w:r>
         <w:t xml:space="preserve"> </w:t>
       </w:r>
-      <w:hyperlink r:id="rId8" w:history="1">
+      <w:hyperlink r:id="rId20" w:history="1">
         <w:r>
           <w:rPr>
             <w:rStyle w:val="Hyperlink"/>
@@ -840,6 +1333,7 @@
           </w:tcPr>
           <w:p>
             <w:r>
+              <w:lastRenderedPageBreak/>
               <w:t>KP Lucid Search</w:t>
             </w:r>
           </w:p>
@@ -915,58 +1409,16 @@
         <w:spacing w:after="160"/>
       </w:pPr>
       <w:r>
-        <w:t>The KP Design System artifacts — Storybook patterns, CSS, design tokens, accessibility standards, and the approved HTML pattern library — are the single, authoritative source of truth. EDS natively produces semantic HTML that is organized as content and functional blocks.  In order to conform to those Design Systems artifacts and standards; a deterministic process needs to be implemented that extracts HTML from the Design System into “stub” files with inserted tokens for content and then that HTML is inserted by JavaScript at decoration time.</w:t>
-      </w:r>
-      <w:r/>
-      <w:r>
-        <w:rPr>
-          <w:b/>
-          <w:bCs/>
-        </w:rPr>
-      </w:r>
-      <w:r/>
-      <w:r/>
-      <w:r/>
-      <w:r/>
-      <w:r/>
-      <w:r/>
-      <w:r/>
-      <w:r/>
-      <w:r/>
-      <w:r/>
-      <w:r/>
-      <w:r/>
-      <w:r/>
-      <w:r/>
-      <w:r/>
-      <w:r/>
-      <w:r/>
-      <w:r/>
+        <w:t xml:space="preserve">The KP Design System artifacts — Storybook patterns, CSS, design tokens, accessibility standards, and the approved HTML pattern library — are the single, authoritative source of truth. EDS natively produces semantic HTML that is organized as content and functional blocks.  </w:t>
+      </w:r>
       <w:proofErr w:type="gramStart"/>
-      <w:r/>
-      <w:r/>
-      <w:r/>
-      <w:r/>
+      <w:r>
+        <w:t>In order to</w:t>
+      </w:r>
       <w:proofErr w:type="gramEnd"/>
-      <w:r/>
-      <w:r/>
-      <w:r/>
-      <w:r/>
-      <w:r/>
-      <w:r/>
-      <w:r/>
-      <w:r/>
-      <w:r/>
-      <w:r/>
-      <w:r/>
-      <w:r/>
-      <w:r/>
-      <w:r/>
-      <w:r/>
-      <w:r/>
-      <w:r/>
-      <w:r/>
-      <w:r/>
+      <w:r>
+        <w:t xml:space="preserve"> conform to those Design Systems artifacts and standards; a deterministic process needs to be implemented that extracts HTML from the Design System into “stub” files with inserted tokens for content and then that HTML is inserted by JavaScript at decoration time.</w:t>
+      </w:r>
     </w:p>
     <w:p>
       <w:pPr>
@@ -1008,8 +1460,6 @@
       <w:r>
         <w:t>One design pattern produces exactly one implementation — the design system is extracted once into a stub file that the block renders from, so there is a single source of DOM and behavior, not two that can drift apart.</w:t>
       </w:r>
-      <w:r/>
-      <w:r/>
     </w:p>
     <w:p>
       <w:pPr>
@@ -1131,21 +1581,13 @@
         </w:rPr>
         <w:t>Design System conformance findings</w:t>
       </w:r>
-      <w:proofErr w:type="gramStart"/>
-      <w:proofErr w:type="gramEnd"/>
-    </w:p>
-    <w:p>
-      <w:pPr>
-        <w:spacing w:before="0" w:after="160"/>
-      </w:pPr>
-      <w:r>
-        <w:t xml:space="preserve">Storybook and EDS build things differently: a Storybook component just takes a JavaScript object of props, while an EDS block reads its content from an authored table that gets turned into real markup when the page loads. To stop those two from turning into two separate copies of the same design that quietly fall out of sync, we made one rule: the block writes the actual code that builds the markup, and the Storybook story just calls that same code. </w:t>
-      </w:r>
-      <w:r>
-        <w:t>So</w:t>
-      </w:r>
-      <w:r>
-        <w:t xml:space="preserve"> there's only one version of the DOM, not a hand-copied second one sitting in Storybook.</w:t>
+    </w:p>
+    <w:p>
+      <w:pPr>
+        <w:spacing w:after="160"/>
+      </w:pPr>
+      <w:r>
+        <w:t>Storybook and EDS build things differently: a Storybook component just takes a JavaScript object of props, while an EDS block reads its content from an authored table that gets turned into real markup when the page loads. To stop those two from turning into two separate copies of the same design that quietly fall out of sync, we made one rule: the block writes the actual code that builds the markup, and the Storybook story just calls that same code. So there's only one version of the DOM, not a hand-copied second one sitting in Storybook.</w:t>
       </w:r>
     </w:p>
     <w:p>
@@ -1175,6 +1617,7 @@
         <w:spacing w:after="160"/>
       </w:pPr>
       <w:r>
+        <w:lastRenderedPageBreak/>
         <w:t>One Repo Per Project is workable at single-project pilot scale, but the "immutable Global Library" half of the architecture is still aspirational — this POC has not yet extracted a genuinely independent, versioned library consumed by more than one project repo, so multi-project reuse and library-versioning discipline are unproven. Page-level governance (the template-governance tooling) and block-level design-system conformance are complementary but separate concerns; a future migration needs both, not one in place of the other.</w:t>
       </w:r>
     </w:p>
@@ -1890,6 +2333,7 @@
           <w:sz w:val="15"/>
           <w:szCs w:val="15"/>
         </w:rPr>
+        <w:lastRenderedPageBreak/>
         <w:t xml:space="preserve">          data-analytics-click="Action Button"&gt;</w:t>
       </w:r>
     </w:p>
@@ -2185,7 +2629,6 @@
           <w:sz w:val="15"/>
           <w:szCs w:val="15"/>
         </w:rPr>
-        <w:lastRenderedPageBreak/>
         <w:t>}</w:t>
       </w:r>
       <w:r>
@@ -2205,7 +2648,7 @@
         <w:br/>
         <w:t xml:space="preserve">Full example - </w:t>
       </w:r>
-      <w:hyperlink r:id="rId9" w:history="1">
+      <w:hyperlink r:id="rId21" w:history="1">
         <w:r>
           <w:rPr>
             <w:rStyle w:val="Hyperlink"/>
@@ -2261,7 +2704,7 @@
     </w:p>
     <w:p>
       <w:pPr>
-        <w:spacing w:before="0" w:after="120"/>
+        <w:spacing w:after="120"/>
       </w:pPr>
       <w:r>
         <w:t xml:space="preserve">SEO &amp; GEO: not an issue, </w:t>
@@ -2290,28 +2733,6 @@
       <w:r>
         <w:t>Keeping each block’s rendered output conformant to the vessel design system has to be a deterministic process, defined and locked down at the outset of a migration — a fixed pipeline (tokens derived from the vessel source, one shared renderer, a CI-gated parity diff) set up once by engineers and enforced mechanically on every change, not something rediscovered or hand-tuned page by page. It cannot be something the Experience Modernization Agent manages. An agent doing content migration has no way to know whether the block scaffolding it’s placing content into is design-system-conformant; it can only work within whatever scaffolding — and whatever token and conformance rules — already exist. That scaffolding has to be built, and its conformance enforced, before content migration begins, not discovered along the way. Conformance to the vessel system happens and can only be measured from within a browser’s executed JS rendering.</w:t>
       </w:r>
-      <w:r>
-        <w:rPr>
-          <w:b/>
-          <w:bCs/>
-        </w:rPr>
-      </w:r>
-      <w:r/>
-      <w:proofErr w:type="gramStart"/>
-      <w:r/>
-      <w:r/>
-      <w:r/>
-      <w:proofErr w:type="gramEnd"/>
-      <w:r/>
-      <w:proofErr w:type="gramStart"/>
-      <w:r/>
-      <w:proofErr w:type="gramEnd"/>
-      <w:r/>
-      <w:proofErr w:type="gramStart"/>
-      <w:r/>
-      <w:proofErr w:type="gramEnd"/>
-      <w:r/>
-      <w:r/>
     </w:p>
     <w:p>
       <w:pPr>
@@ -2329,7 +2750,7 @@
 </file>
 
 <file path=word/numbering.xml><?xml version="1.0" encoding="utf-8"?>
-<w:numbering xmlns:wpc="http://schemas.microsoft.com/office/word/2010/wordprocessingCanvas" xmlns:cx="http://schemas.microsoft.com/office/drawing/2014/chartex" xmlns:cx1="http://schemas.microsoft.com/office/drawing/2015/9/8/chartex" xmlns:cx2="http://schemas.microsoft.com/office/drawing/2015/10/21/chartex" xmlns:cx3="http://schemas.microsoft.com/office/drawing/2016/5/9/chartex" xmlns:cx4="http://schemas.microsoft.com/office/drawing/2016/5/10/chartex" xmlns:cx5="http://schemas.microsoft.com/office/drawing/2016/5/11/chartex" xmlns:cx6="http://schemas.microsoft.com/office/drawing/2016/5/12/chartex" xmlns:cx7="http://schemas.microsoft.com/office/drawing/2016/5/13/chartex" xmlns:cx8="http://schemas.microsoft.com/office/drawing/2016/5/14/chartex" xmlns:mc="http://schemas.openxmlformats.org/markup-compatibility/2006" xmlns:m="http://schemas.openxmlformats.org/officeDocument/2006/math" xmlns:aink="http://schemas.microsoft.com/office/drawing/2016/ink" xmlns:am3d="http://schemas.microsoft.com/office/drawing/2017/model3d" xmlns:oel="http://schemas.microsoft.com/office/2019/extlst" xmlns:r="http://schemas.openxmlformats.org/officeDocument/2006/relationships" xmlns:wp14="http://schemas.microsoft.com/office/word/2010/wordprocessingDrawing" xmlns:wp="http://schemas.openxmlformats.org/drawingml/2006/wordprocessingDrawing" xmlns:wpg="http://schemas.microsoft.com/office/word/2010/wordprocessingGroup" xmlns:wpi="http://schemas.microsoft.com/office/word/2010/wordprocessingInk" xmlns:wps="http://schemas.microsoft.com/office/word/2010/wordprocessingShape" xmlns:o="urn:schemas-microsoft-com:office:office" xmlns:v="urn:schemas-microsoft-com:vml" xmlns:w10="urn:schemas-microsoft-com:office:word" xmlns:w="http://schemas.openxmlformats.org/wordprocessingml/2006/main" xmlns:w14="http://schemas.microsoft.com/office/word/2010/wordml" xmlns:w15="http://schemas.microsoft.com/office/word/2012/wordml" xmlns:w16cei="http://schemas.microsoft.com/office/word/2026/wordml/cei" xmlns:w16cex="http://schemas.microsoft.com/office/word/2018/wordml/cex" xmlns:w16cid="http://schemas.microsoft.com/office/word/2016/wordml/cid" xmlns:w16="http://schemas.microsoft.com/office/word/2018/wordml" xmlns:w16sdtdh="http://schemas.microsoft.com/office/word/2020/wordml/sdtdatahash" xmlns:w16sdtfl="http://schemas.microsoft.com/office/word/2024/wordml/sdtformatlock" xmlns:w16se="http://schemas.microsoft.com/office/word/2015/wordml/symex" xmlns:w16du="http://schemas.microsoft.com/office/word/2023/wordml/word16du" xmlns:wne="http://schemas.microsoft.com/office/word/2006/wordml" mc:Ignorable="w14 w15 w16se w16cid w16 w16cex w16sdtdh w16sdtfl w16du wp14">
+<w:numbering xmlns:wpc="http://schemas.microsoft.com/office/word/2010/wordprocessingCanvas" xmlns:cx="http://schemas.microsoft.com/office/drawing/2014/chartex" xmlns:cx1="http://schemas.microsoft.com/office/drawing/2015/9/8/chartex" xmlns:cx2="http://schemas.microsoft.com/office/drawing/2015/10/21/chartex" xmlns:cx3="http://schemas.microsoft.com/office/drawing/2016/5/9/chartex" xmlns:cx4="http://schemas.microsoft.com/office/drawing/2016/5/10/chartex" xmlns:cx5="http://schemas.microsoft.com/office/drawing/2016/5/11/chartex" xmlns:cx6="http://schemas.microsoft.com/office/drawing/2016/5/12/chartex" xmlns:cx7="http://schemas.microsoft.com/office/drawing/2016/5/13/chartex" xmlns:cx8="http://schemas.microsoft.com/office/drawing/2016/5/14/chartex" xmlns:mc="http://schemas.openxmlformats.org/markup-compatibility/2006" xmlns:m="http://schemas.openxmlformats.org/officeDocument/2006/math" xmlns:aink="http://schemas.microsoft.com/office/drawing/2016/ink" xmlns:am3d="http://schemas.microsoft.com/office/drawing/2017/model3d" xmlns:oel="http://schemas.microsoft.com/office/2019/extlst" xmlns:r="http://schemas.openxmlformats.org/officeDocument/2006/relationships" xmlns:wp14="http://schemas.microsoft.com/office/word/2010/wordprocessingDrawing" xmlns:wp="http://schemas.openxmlformats.org/drawingml/2006/wordprocessingDrawing" xmlns:wpg="http://schemas.microsoft.com/office/word/2010/wordprocessingGroup" xmlns:wpi="http://schemas.microsoft.com/office/word/2010/wordprocessingInk" xmlns:wps="http://schemas.microsoft.com/office/word/2010/wordprocessingShape" xmlns:o="urn:schemas-microsoft-com:office:office" xmlns:v="urn:schemas-microsoft-com:vml" xmlns:w10="urn:schemas-microsoft-com:office:word" xmlns:w="http://schemas.openxmlformats.org/wordprocessingml/2006/main" xmlns:w14="http://schemas.microsoft.com/office/word/2010/wordml" xmlns:w15="http://schemas.microsoft.com/office/word/2012/wordml" xmlns:w16cex="http://schemas.microsoft.com/office/word/2018/wordml/cex" xmlns:w16cid="http://schemas.microsoft.com/office/word/2016/wordml/cid" xmlns:w16="http://schemas.microsoft.com/office/word/2018/wordml" xmlns:w16sdtdh="http://schemas.microsoft.com/office/word/2020/wordml/sdtdatahash" xmlns:w16sdtfl="http://schemas.microsoft.com/office/word/2024/wordml/sdtformatlock" xmlns:w16se="http://schemas.microsoft.com/office/word/2015/wordml/symex" xmlns:w16du="http://schemas.microsoft.com/office/word/2023/wordml/word16du" xmlns:wne="http://schemas.microsoft.com/office/word/2006/wordml" mc:Ignorable="w14 w15 w16se w16cid w16 w16cex w16sdtdh w16sdtfl w16du wp14">
   <w:abstractNum w:abstractNumId="0" w15:restartNumberingAfterBreak="0">
     <w:nsid w:val="15813025"/>
     <w:multiLevelType w:val="hybridMultilevel"/>
@@ -2444,6 +2865,345 @@
     </w:lvl>
   </w:abstractNum>
   <w:abstractNum w:abstractNumId="1" w15:restartNumberingAfterBreak="0">
+    <w:nsid w:val="17914BEC"/>
+    <w:multiLevelType w:val="hybridMultilevel"/>
+    <w:tmpl w:val="899A5124"/>
+    <w:lvl w:ilvl="0" w:tplc="04090001">
+      <w:start w:val="1"/>
+      <w:numFmt w:val="bullet"/>
+      <w:lvlText w:val=""/>
+      <w:lvlJc w:val="left"/>
+      <w:pPr>
+        <w:ind w:left="720" w:hanging="360"/>
+      </w:pPr>
+      <w:rPr>
+        <w:rFonts w:ascii="Symbol" w:hAnsi="Symbol" w:hint="default"/>
+      </w:rPr>
+    </w:lvl>
+    <w:lvl w:ilvl="1" w:tplc="04090003" w:tentative="1">
+      <w:start w:val="1"/>
+      <w:numFmt w:val="bullet"/>
+      <w:lvlText w:val="o"/>
+      <w:lvlJc w:val="left"/>
+      <w:pPr>
+        <w:ind w:left="1440" w:hanging="360"/>
+      </w:pPr>
+      <w:rPr>
+        <w:rFonts w:ascii="Courier New" w:hAnsi="Courier New" w:cs="Courier New" w:hint="default"/>
+      </w:rPr>
+    </w:lvl>
+    <w:lvl w:ilvl="2" w:tplc="04090005" w:tentative="1">
+      <w:start w:val="1"/>
+      <w:numFmt w:val="bullet"/>
+      <w:lvlText w:val=""/>
+      <w:lvlJc w:val="left"/>
+      <w:pPr>
+        <w:ind w:left="2160" w:hanging="360"/>
+      </w:pPr>
+      <w:rPr>
+        <w:rFonts w:ascii="Wingdings" w:hAnsi="Wingdings" w:hint="default"/>
+      </w:rPr>
+    </w:lvl>
+    <w:lvl w:ilvl="3" w:tplc="04090001" w:tentative="1">
+      <w:start w:val="1"/>
+      <w:numFmt w:val="bullet"/>
+      <w:lvlText w:val=""/>
+      <w:lvlJc w:val="left"/>
+      <w:pPr>
+        <w:ind w:left="2880" w:hanging="360"/>
+      </w:pPr>
+      <w:rPr>
+        <w:rFonts w:ascii="Symbol" w:hAnsi="Symbol" w:hint="default"/>
+      </w:rPr>
+    </w:lvl>
+    <w:lvl w:ilvl="4" w:tplc="04090003" w:tentative="1">
+      <w:start w:val="1"/>
+      <w:numFmt w:val="bullet"/>
+      <w:lvlText w:val="o"/>
+      <w:lvlJc w:val="left"/>
+      <w:pPr>
+        <w:ind w:left="3600" w:hanging="360"/>
+      </w:pPr>
+      <w:rPr>
+        <w:rFonts w:ascii="Courier New" w:hAnsi="Courier New" w:cs="Courier New" w:hint="default"/>
+      </w:rPr>
+    </w:lvl>
+    <w:lvl w:ilvl="5" w:tplc="04090005" w:tentative="1">
+      <w:start w:val="1"/>
+      <w:numFmt w:val="bullet"/>
+      <w:lvlText w:val=""/>
+      <w:lvlJc w:val="left"/>
+      <w:pPr>
+        <w:ind w:left="4320" w:hanging="360"/>
+      </w:pPr>
+      <w:rPr>
+        <w:rFonts w:ascii="Wingdings" w:hAnsi="Wingdings" w:hint="default"/>
+      </w:rPr>
+    </w:lvl>
+    <w:lvl w:ilvl="6" w:tplc="04090001" w:tentative="1">
+      <w:start w:val="1"/>
+      <w:numFmt w:val="bullet"/>
+      <w:lvlText w:val=""/>
+      <w:lvlJc w:val="left"/>
+      <w:pPr>
+        <w:ind w:left="5040" w:hanging="360"/>
+      </w:pPr>
+      <w:rPr>
+        <w:rFonts w:ascii="Symbol" w:hAnsi="Symbol" w:hint="default"/>
+      </w:rPr>
+    </w:lvl>
+    <w:lvl w:ilvl="7" w:tplc="04090003" w:tentative="1">
+      <w:start w:val="1"/>
+      <w:numFmt w:val="bullet"/>
+      <w:lvlText w:val="o"/>
+      <w:lvlJc w:val="left"/>
+      <w:pPr>
+        <w:ind w:left="5760" w:hanging="360"/>
+      </w:pPr>
+      <w:rPr>
+        <w:rFonts w:ascii="Courier New" w:hAnsi="Courier New" w:cs="Courier New" w:hint="default"/>
+      </w:rPr>
+    </w:lvl>
+    <w:lvl w:ilvl="8" w:tplc="04090005" w:tentative="1">
+      <w:start w:val="1"/>
+      <w:numFmt w:val="bullet"/>
+      <w:lvlText w:val=""/>
+      <w:lvlJc w:val="left"/>
+      <w:pPr>
+        <w:ind w:left="6480" w:hanging="360"/>
+      </w:pPr>
+      <w:rPr>
+        <w:rFonts w:ascii="Wingdings" w:hAnsi="Wingdings" w:hint="default"/>
+      </w:rPr>
+    </w:lvl>
+  </w:abstractNum>
+  <w:abstractNum w:abstractNumId="2" w15:restartNumberingAfterBreak="0">
+    <w:nsid w:val="388224C2"/>
+    <w:multiLevelType w:val="hybridMultilevel"/>
+    <w:tmpl w:val="7B8E52E8"/>
+    <w:lvl w:ilvl="0" w:tplc="6C2A0D7A">
+      <w:start w:val="1"/>
+      <w:numFmt w:val="bullet"/>
+      <w:lvlText w:val="-"/>
+      <w:lvlJc w:val="left"/>
+      <w:pPr>
+        <w:ind w:left="720" w:hanging="360"/>
+      </w:pPr>
+      <w:rPr>
+        <w:rFonts w:ascii="Adobe Clean" w:eastAsia="Adobe Clean" w:hAnsi="Adobe Clean" w:cs="Adobe Clean" w:hint="default"/>
+      </w:rPr>
+    </w:lvl>
+    <w:lvl w:ilvl="1" w:tplc="04090003" w:tentative="1">
+      <w:start w:val="1"/>
+      <w:numFmt w:val="bullet"/>
+      <w:lvlText w:val="o"/>
+      <w:lvlJc w:val="left"/>
+      <w:pPr>
+        <w:ind w:left="1440" w:hanging="360"/>
+      </w:pPr>
+      <w:rPr>
+        <w:rFonts w:ascii="Courier New" w:hAnsi="Courier New" w:cs="Courier New" w:hint="default"/>
+      </w:rPr>
+    </w:lvl>
+    <w:lvl w:ilvl="2" w:tplc="04090005" w:tentative="1">
+      <w:start w:val="1"/>
+      <w:numFmt w:val="bullet"/>
+      <w:lvlText w:val=""/>
+      <w:lvlJc w:val="left"/>
+      <w:pPr>
+        <w:ind w:left="2160" w:hanging="360"/>
+      </w:pPr>
+      <w:rPr>
+        <w:rFonts w:ascii="Wingdings" w:hAnsi="Wingdings" w:hint="default"/>
+      </w:rPr>
+    </w:lvl>
+    <w:lvl w:ilvl="3" w:tplc="04090001" w:tentative="1">
+      <w:start w:val="1"/>
+      <w:numFmt w:val="bullet"/>
+      <w:lvlText w:val=""/>
+      <w:lvlJc w:val="left"/>
+      <w:pPr>
+        <w:ind w:left="2880" w:hanging="360"/>
+      </w:pPr>
+      <w:rPr>
+        <w:rFonts w:ascii="Symbol" w:hAnsi="Symbol" w:hint="default"/>
+      </w:rPr>
+    </w:lvl>
+    <w:lvl w:ilvl="4" w:tplc="04090003" w:tentative="1">
+      <w:start w:val="1"/>
+      <w:numFmt w:val="bullet"/>
+      <w:lvlText w:val="o"/>
+      <w:lvlJc w:val="left"/>
+      <w:pPr>
+        <w:ind w:left="3600" w:hanging="360"/>
+      </w:pPr>
+      <w:rPr>
+        <w:rFonts w:ascii="Courier New" w:hAnsi="Courier New" w:cs="Courier New" w:hint="default"/>
+      </w:rPr>
+    </w:lvl>
+    <w:lvl w:ilvl="5" w:tplc="04090005" w:tentative="1">
+      <w:start w:val="1"/>
+      <w:numFmt w:val="bullet"/>
+      <w:lvlText w:val=""/>
+      <w:lvlJc w:val="left"/>
+      <w:pPr>
+        <w:ind w:left="4320" w:hanging="360"/>
+      </w:pPr>
+      <w:rPr>
+        <w:rFonts w:ascii="Wingdings" w:hAnsi="Wingdings" w:hint="default"/>
+      </w:rPr>
+    </w:lvl>
+    <w:lvl w:ilvl="6" w:tplc="04090001" w:tentative="1">
+      <w:start w:val="1"/>
+      <w:numFmt w:val="bullet"/>
+      <w:lvlText w:val=""/>
+      <w:lvlJc w:val="left"/>
+      <w:pPr>
+        <w:ind w:left="5040" w:hanging="360"/>
+      </w:pPr>
+      <w:rPr>
+        <w:rFonts w:ascii="Symbol" w:hAnsi="Symbol" w:hint="default"/>
+      </w:rPr>
+    </w:lvl>
+    <w:lvl w:ilvl="7" w:tplc="04090003" w:tentative="1">
+      <w:start w:val="1"/>
+      <w:numFmt w:val="bullet"/>
+      <w:lvlText w:val="o"/>
+      <w:lvlJc w:val="left"/>
+      <w:pPr>
+        <w:ind w:left="5760" w:hanging="360"/>
+      </w:pPr>
+      <w:rPr>
+        <w:rFonts w:ascii="Courier New" w:hAnsi="Courier New" w:cs="Courier New" w:hint="default"/>
+      </w:rPr>
+    </w:lvl>
+    <w:lvl w:ilvl="8" w:tplc="04090005" w:tentative="1">
+      <w:start w:val="1"/>
+      <w:numFmt w:val="bullet"/>
+      <w:lvlText w:val=""/>
+      <w:lvlJc w:val="left"/>
+      <w:pPr>
+        <w:ind w:left="6480" w:hanging="360"/>
+      </w:pPr>
+      <w:rPr>
+        <w:rFonts w:ascii="Wingdings" w:hAnsi="Wingdings" w:hint="default"/>
+      </w:rPr>
+    </w:lvl>
+  </w:abstractNum>
+  <w:abstractNum w:abstractNumId="3" w15:restartNumberingAfterBreak="0">
+    <w:nsid w:val="4D6851A7"/>
+    <w:multiLevelType w:val="hybridMultilevel"/>
+    <w:tmpl w:val="570618CC"/>
+    <w:lvl w:ilvl="0" w:tplc="6C2A0D7A">
+      <w:start w:val="1"/>
+      <w:numFmt w:val="bullet"/>
+      <w:lvlText w:val="-"/>
+      <w:lvlJc w:val="left"/>
+      <w:pPr>
+        <w:ind w:left="720" w:hanging="360"/>
+      </w:pPr>
+      <w:rPr>
+        <w:rFonts w:ascii="Adobe Clean" w:eastAsia="Adobe Clean" w:hAnsi="Adobe Clean" w:cs="Adobe Clean" w:hint="default"/>
+      </w:rPr>
+    </w:lvl>
+    <w:lvl w:ilvl="1" w:tplc="04090003" w:tentative="1">
+      <w:start w:val="1"/>
+      <w:numFmt w:val="bullet"/>
+      <w:lvlText w:val="o"/>
+      <w:lvlJc w:val="left"/>
+      <w:pPr>
+        <w:ind w:left="1440" w:hanging="360"/>
+      </w:pPr>
+      <w:rPr>
+        <w:rFonts w:ascii="Courier New" w:hAnsi="Courier New" w:cs="Courier New" w:hint="default"/>
+      </w:rPr>
+    </w:lvl>
+    <w:lvl w:ilvl="2" w:tplc="04090005" w:tentative="1">
+      <w:start w:val="1"/>
+      <w:numFmt w:val="bullet"/>
+      <w:lvlText w:val=""/>
+      <w:lvlJc w:val="left"/>
+      <w:pPr>
+        <w:ind w:left="2160" w:hanging="360"/>
+      </w:pPr>
+      <w:rPr>
+        <w:rFonts w:ascii="Wingdings" w:hAnsi="Wingdings" w:hint="default"/>
+      </w:rPr>
+    </w:lvl>
+    <w:lvl w:ilvl="3" w:tplc="04090001" w:tentative="1">
+      <w:start w:val="1"/>
+      <w:numFmt w:val="bullet"/>
+      <w:lvlText w:val=""/>
+      <w:lvlJc w:val="left"/>
+      <w:pPr>
+        <w:ind w:left="2880" w:hanging="360"/>
+      </w:pPr>
+      <w:rPr>
+        <w:rFonts w:ascii="Symbol" w:hAnsi="Symbol" w:hint="default"/>
+      </w:rPr>
+    </w:lvl>
+    <w:lvl w:ilvl="4" w:tplc="04090003" w:tentative="1">
+      <w:start w:val="1"/>
+      <w:numFmt w:val="bullet"/>
+      <w:lvlText w:val="o"/>
+      <w:lvlJc w:val="left"/>
+      <w:pPr>
+        <w:ind w:left="3600" w:hanging="360"/>
+      </w:pPr>
+      <w:rPr>
+        <w:rFonts w:ascii="Courier New" w:hAnsi="Courier New" w:cs="Courier New" w:hint="default"/>
+      </w:rPr>
+    </w:lvl>
+    <w:lvl w:ilvl="5" w:tplc="04090005" w:tentative="1">
+      <w:start w:val="1"/>
+      <w:numFmt w:val="bullet"/>
+      <w:lvlText w:val=""/>
+      <w:lvlJc w:val="left"/>
+      <w:pPr>
+        <w:ind w:left="4320" w:hanging="360"/>
+      </w:pPr>
+      <w:rPr>
+        <w:rFonts w:ascii="Wingdings" w:hAnsi="Wingdings" w:hint="default"/>
+      </w:rPr>
+    </w:lvl>
+    <w:lvl w:ilvl="6" w:tplc="04090001" w:tentative="1">
+      <w:start w:val="1"/>
+      <w:numFmt w:val="bullet"/>
+      <w:lvlText w:val=""/>
+      <w:lvlJc w:val="left"/>
+      <w:pPr>
+        <w:ind w:left="5040" w:hanging="360"/>
+      </w:pPr>
+      <w:rPr>
+        <w:rFonts w:ascii="Symbol" w:hAnsi="Symbol" w:hint="default"/>
+      </w:rPr>
+    </w:lvl>
+    <w:lvl w:ilvl="7" w:tplc="04090003" w:tentative="1">
+      <w:start w:val="1"/>
+      <w:numFmt w:val="bullet"/>
+      <w:lvlText w:val="o"/>
+      <w:lvlJc w:val="left"/>
+      <w:pPr>
+        <w:ind w:left="5760" w:hanging="360"/>
+      </w:pPr>
+      <w:rPr>
+        <w:rFonts w:ascii="Courier New" w:hAnsi="Courier New" w:cs="Courier New" w:hint="default"/>
+      </w:rPr>
+    </w:lvl>
+    <w:lvl w:ilvl="8" w:tplc="04090005" w:tentative="1">
+      <w:start w:val="1"/>
+      <w:numFmt w:val="bullet"/>
+      <w:lvlText w:val=""/>
+      <w:lvlJc w:val="left"/>
+      <w:pPr>
+        <w:ind w:left="6480" w:hanging="360"/>
+      </w:pPr>
+      <w:rPr>
+        <w:rFonts w:ascii="Wingdings" w:hAnsi="Wingdings" w:hint="default"/>
+      </w:rPr>
+    </w:lvl>
+  </w:abstractNum>
+  <w:abstractNum w:abstractNumId="4" w15:restartNumberingAfterBreak="0">
     <w:nsid w:val="6E15795E"/>
     <w:multiLevelType w:val="hybridMultilevel"/>
     <w:tmpl w:val="C27A7632"/>
@@ -2501,7 +3261,7 @@
       <w:lvlJc w:val="left"/>
     </w:lvl>
   </w:abstractNum>
-  <w:abstractNum w:abstractNumId="2" w15:restartNumberingAfterBreak="0">
+  <w:abstractNum w:abstractNumId="5" w15:restartNumberingAfterBreak="0">
     <w:nsid w:val="71A80A6B"/>
     <w:multiLevelType w:val="hybridMultilevel"/>
     <w:tmpl w:val="BA444B90"/>
@@ -2614,7 +3374,7 @@
       </w:rPr>
     </w:lvl>
   </w:abstractNum>
-  <w:abstractNum w:abstractNumId="3" w15:restartNumberingAfterBreak="0">
+  <w:abstractNum w:abstractNumId="6" w15:restartNumberingAfterBreak="0">
     <w:nsid w:val="7E751461"/>
     <w:multiLevelType w:val="hybridMultilevel"/>
     <w:tmpl w:val="0F3AA642"/>
@@ -2701,13 +3461,13 @@
     </w:lvl>
   </w:abstractNum>
   <w:num w:numId="1" w16cid:durableId="1631130241">
-    <w:abstractNumId w:val="3"/>
+    <w:abstractNumId w:val="6"/>
     <w:lvlOverride w:ilvl="0">
       <w:startOverride w:val="1"/>
     </w:lvlOverride>
   </w:num>
   <w:num w:numId="2" w16cid:durableId="195850360">
-    <w:abstractNumId w:val="1"/>
+    <w:abstractNumId w:val="4"/>
     <w:lvlOverride w:ilvl="0">
       <w:startOverride w:val="1"/>
     </w:lvlOverride>
@@ -2716,7 +3476,16 @@
     <w:abstractNumId w:val="0"/>
   </w:num>
   <w:num w:numId="4" w16cid:durableId="262687291">
+    <w:abstractNumId w:val="5"/>
+  </w:num>
+  <w:num w:numId="5" w16cid:durableId="1213930100">
+    <w:abstractNumId w:val="1"/>
+  </w:num>
+  <w:num w:numId="6" w16cid:durableId="563179481">
     <w:abstractNumId w:val="2"/>
+  </w:num>
+  <w:num w:numId="7" w16cid:durableId="777332122">
+    <w:abstractNumId w:val="3"/>
   </w:num>
 </w:numbering>
 </file>
@@ -3124,6 +3893,7 @@
   </w:style>
   <w:style w:type="paragraph" w:styleId="Heading2">
     <w:name w:val="heading 2"/>
+    <w:link w:val="Heading2Char"/>
     <w:uiPriority w:val="9"/>
     <w:unhideWhenUsed/>
     <w:qFormat/>
@@ -3180,6 +3950,77 @@
     </w:pPr>
     <w:rPr>
       <w:color w:val="1F4D78"/>
+    </w:rPr>
+  </w:style>
+  <w:style w:type="paragraph" w:styleId="Heading7">
+    <w:name w:val="heading 7"/>
+    <w:basedOn w:val="Normal"/>
+    <w:next w:val="Normal"/>
+    <w:link w:val="Heading7Char"/>
+    <w:uiPriority w:val="9"/>
+    <w:semiHidden/>
+    <w:unhideWhenUsed/>
+    <w:qFormat/>
+    <w:rsid w:val="00F80EE7"/>
+    <w:pPr>
+      <w:keepNext/>
+      <w:keepLines/>
+      <w:spacing w:before="40"/>
+      <w:outlineLvl w:val="6"/>
+    </w:pPr>
+    <w:rPr>
+      <w:rFonts w:asciiTheme="majorHAnsi" w:eastAsiaTheme="majorEastAsia" w:hAnsiTheme="majorHAnsi" w:cstheme="majorBidi"/>
+      <w:i/>
+      <w:iCs/>
+      <w:color w:val="0A2F40" w:themeColor="accent1" w:themeShade="7F"/>
+    </w:rPr>
+  </w:style>
+  <w:style w:type="paragraph" w:styleId="Heading8">
+    <w:name w:val="heading 8"/>
+    <w:basedOn w:val="Normal"/>
+    <w:next w:val="Normal"/>
+    <w:link w:val="Heading8Char"/>
+    <w:uiPriority w:val="9"/>
+    <w:semiHidden/>
+    <w:unhideWhenUsed/>
+    <w:qFormat/>
+    <w:rsid w:val="00F80EE7"/>
+    <w:pPr>
+      <w:keepNext/>
+      <w:keepLines/>
+      <w:spacing w:before="40"/>
+      <w:outlineLvl w:val="7"/>
+    </w:pPr>
+    <w:rPr>
+      <w:rFonts w:asciiTheme="majorHAnsi" w:eastAsiaTheme="majorEastAsia" w:hAnsiTheme="majorHAnsi" w:cstheme="majorBidi"/>
+      <w:color w:val="272727" w:themeColor="text1" w:themeTint="D8"/>
+      <w:sz w:val="21"/>
+      <w:szCs w:val="21"/>
+    </w:rPr>
+  </w:style>
+  <w:style w:type="paragraph" w:styleId="Heading9">
+    <w:name w:val="heading 9"/>
+    <w:basedOn w:val="Normal"/>
+    <w:next w:val="Normal"/>
+    <w:link w:val="Heading9Char"/>
+    <w:uiPriority w:val="9"/>
+    <w:semiHidden/>
+    <w:unhideWhenUsed/>
+    <w:qFormat/>
+    <w:rsid w:val="00F80EE7"/>
+    <w:pPr>
+      <w:keepNext/>
+      <w:keepLines/>
+      <w:spacing w:before="40"/>
+      <w:outlineLvl w:val="8"/>
+    </w:pPr>
+    <w:rPr>
+      <w:rFonts w:asciiTheme="majorHAnsi" w:eastAsiaTheme="majorEastAsia" w:hAnsiTheme="majorHAnsi" w:cstheme="majorBidi"/>
+      <w:i/>
+      <w:iCs/>
+      <w:color w:val="272727" w:themeColor="text1" w:themeTint="D8"/>
+      <w:sz w:val="21"/>
+      <w:szCs w:val="21"/>
     </w:rPr>
   </w:style>
   <w:style w:type="character" w:default="1" w:styleId="DefaultParagraphFont">
@@ -3303,6 +4144,330 @@
     <w:rPr>
       <w:color w:val="605E5C"/>
       <w:shd w:val="clear" w:color="auto" w:fill="E1DFDD"/>
+    </w:rPr>
+  </w:style>
+  <w:style w:type="character" w:customStyle="1" w:styleId="normaltextrun">
+    <w:name w:val="normaltextrun"/>
+    <w:basedOn w:val="DefaultParagraphFont"/>
+    <w:rsid w:val="007D5D0B"/>
+  </w:style>
+  <w:style w:type="character" w:customStyle="1" w:styleId="eop">
+    <w:name w:val="eop"/>
+    <w:basedOn w:val="DefaultParagraphFont"/>
+    <w:rsid w:val="007D5D0B"/>
+  </w:style>
+  <w:style w:type="character" w:styleId="BookTitle">
+    <w:name w:val="Book Title"/>
+    <w:basedOn w:val="DefaultParagraphFont"/>
+    <w:uiPriority w:val="33"/>
+    <w:qFormat/>
+    <w:rsid w:val="00F80EE7"/>
+    <w:rPr>
+      <w:b/>
+      <w:bCs/>
+      <w:i/>
+      <w:iCs/>
+      <w:spacing w:val="5"/>
+    </w:rPr>
+  </w:style>
+  <w:style w:type="paragraph" w:styleId="Caption">
+    <w:name w:val="caption"/>
+    <w:basedOn w:val="Normal"/>
+    <w:next w:val="Normal"/>
+    <w:uiPriority w:val="35"/>
+    <w:semiHidden/>
+    <w:unhideWhenUsed/>
+    <w:qFormat/>
+    <w:rsid w:val="00F80EE7"/>
+    <w:pPr>
+      <w:spacing w:after="200"/>
+    </w:pPr>
+    <w:rPr>
+      <w:i/>
+      <w:iCs/>
+      <w:color w:val="0E2841" w:themeColor="text2"/>
+      <w:sz w:val="18"/>
+      <w:szCs w:val="18"/>
+    </w:rPr>
+  </w:style>
+  <w:style w:type="character" w:styleId="Emphasis">
+    <w:name w:val="Emphasis"/>
+    <w:basedOn w:val="DefaultParagraphFont"/>
+    <w:uiPriority w:val="20"/>
+    <w:qFormat/>
+    <w:rsid w:val="00F80EE7"/>
+    <w:rPr>
+      <w:i/>
+      <w:iCs/>
+    </w:rPr>
+  </w:style>
+  <w:style w:type="character" w:customStyle="1" w:styleId="Heading7Char">
+    <w:name w:val="Heading 7 Char"/>
+    <w:basedOn w:val="DefaultParagraphFont"/>
+    <w:link w:val="Heading7"/>
+    <w:uiPriority w:val="9"/>
+    <w:semiHidden/>
+    <w:rsid w:val="00F80EE7"/>
+    <w:rPr>
+      <w:rFonts w:asciiTheme="majorHAnsi" w:eastAsiaTheme="majorEastAsia" w:hAnsiTheme="majorHAnsi" w:cstheme="majorBidi"/>
+      <w:i/>
+      <w:iCs/>
+      <w:color w:val="0A2F40" w:themeColor="accent1" w:themeShade="7F"/>
+    </w:rPr>
+  </w:style>
+  <w:style w:type="character" w:customStyle="1" w:styleId="Heading8Char">
+    <w:name w:val="Heading 8 Char"/>
+    <w:basedOn w:val="DefaultParagraphFont"/>
+    <w:link w:val="Heading8"/>
+    <w:uiPriority w:val="9"/>
+    <w:semiHidden/>
+    <w:rsid w:val="00F80EE7"/>
+    <w:rPr>
+      <w:rFonts w:asciiTheme="majorHAnsi" w:eastAsiaTheme="majorEastAsia" w:hAnsiTheme="majorHAnsi" w:cstheme="majorBidi"/>
+      <w:color w:val="272727" w:themeColor="text1" w:themeTint="D8"/>
+      <w:sz w:val="21"/>
+      <w:szCs w:val="21"/>
+    </w:rPr>
+  </w:style>
+  <w:style w:type="character" w:customStyle="1" w:styleId="Heading9Char">
+    <w:name w:val="Heading 9 Char"/>
+    <w:basedOn w:val="DefaultParagraphFont"/>
+    <w:link w:val="Heading9"/>
+    <w:uiPriority w:val="9"/>
+    <w:semiHidden/>
+    <w:rsid w:val="00F80EE7"/>
+    <w:rPr>
+      <w:rFonts w:asciiTheme="majorHAnsi" w:eastAsiaTheme="majorEastAsia" w:hAnsiTheme="majorHAnsi" w:cstheme="majorBidi"/>
+      <w:i/>
+      <w:iCs/>
+      <w:color w:val="272727" w:themeColor="text1" w:themeTint="D8"/>
+      <w:sz w:val="21"/>
+      <w:szCs w:val="21"/>
+    </w:rPr>
+  </w:style>
+  <w:style w:type="character" w:styleId="IntenseEmphasis">
+    <w:name w:val="Intense Emphasis"/>
+    <w:basedOn w:val="DefaultParagraphFont"/>
+    <w:uiPriority w:val="21"/>
+    <w:qFormat/>
+    <w:rsid w:val="00F80EE7"/>
+    <w:rPr>
+      <w:i/>
+      <w:iCs/>
+      <w:color w:val="156082" w:themeColor="accent1"/>
+    </w:rPr>
+  </w:style>
+  <w:style w:type="paragraph" w:styleId="IntenseQuote">
+    <w:name w:val="Intense Quote"/>
+    <w:basedOn w:val="Normal"/>
+    <w:next w:val="Normal"/>
+    <w:link w:val="IntenseQuoteChar"/>
+    <w:uiPriority w:val="30"/>
+    <w:qFormat/>
+    <w:rsid w:val="00F80EE7"/>
+    <w:pPr>
+      <w:pBdr>
+        <w:top w:val="single" w:sz="4" w:space="10" w:color="156082" w:themeColor="accent1"/>
+        <w:bottom w:val="single" w:sz="4" w:space="10" w:color="156082" w:themeColor="accent1"/>
+      </w:pBdr>
+      <w:spacing w:before="360" w:after="360"/>
+      <w:ind w:left="864" w:right="864"/>
+      <w:jc w:val="center"/>
+    </w:pPr>
+    <w:rPr>
+      <w:i/>
+      <w:iCs/>
+      <w:color w:val="156082" w:themeColor="accent1"/>
+    </w:rPr>
+  </w:style>
+  <w:style w:type="character" w:customStyle="1" w:styleId="IntenseQuoteChar">
+    <w:name w:val="Intense Quote Char"/>
+    <w:basedOn w:val="DefaultParagraphFont"/>
+    <w:link w:val="IntenseQuote"/>
+    <w:uiPriority w:val="30"/>
+    <w:rsid w:val="00F80EE7"/>
+    <w:rPr>
+      <w:i/>
+      <w:iCs/>
+      <w:color w:val="156082" w:themeColor="accent1"/>
+    </w:rPr>
+  </w:style>
+  <w:style w:type="character" w:styleId="IntenseReference">
+    <w:name w:val="Intense Reference"/>
+    <w:basedOn w:val="DefaultParagraphFont"/>
+    <w:uiPriority w:val="32"/>
+    <w:qFormat/>
+    <w:rsid w:val="00F80EE7"/>
+    <w:rPr>
+      <w:b/>
+      <w:bCs/>
+      <w:smallCaps/>
+      <w:color w:val="156082" w:themeColor="accent1"/>
+      <w:spacing w:val="5"/>
+    </w:rPr>
+  </w:style>
+  <w:style w:type="paragraph" w:styleId="NoSpacing">
+    <w:name w:val="No Spacing"/>
+    <w:uiPriority w:val="1"/>
+    <w:qFormat/>
+    <w:rsid w:val="00F80EE7"/>
+  </w:style>
+  <w:style w:type="paragraph" w:styleId="Quote">
+    <w:name w:val="Quote"/>
+    <w:basedOn w:val="Normal"/>
+    <w:next w:val="Normal"/>
+    <w:link w:val="QuoteChar"/>
+    <w:uiPriority w:val="29"/>
+    <w:qFormat/>
+    <w:rsid w:val="00F80EE7"/>
+    <w:pPr>
+      <w:spacing w:before="200" w:after="160"/>
+      <w:ind w:left="864" w:right="864"/>
+      <w:jc w:val="center"/>
+    </w:pPr>
+    <w:rPr>
+      <w:i/>
+      <w:iCs/>
+      <w:color w:val="404040" w:themeColor="text1" w:themeTint="BF"/>
+    </w:rPr>
+  </w:style>
+  <w:style w:type="character" w:customStyle="1" w:styleId="QuoteChar">
+    <w:name w:val="Quote Char"/>
+    <w:basedOn w:val="DefaultParagraphFont"/>
+    <w:link w:val="Quote"/>
+    <w:uiPriority w:val="29"/>
+    <w:rsid w:val="00F80EE7"/>
+    <w:rPr>
+      <w:i/>
+      <w:iCs/>
+      <w:color w:val="404040" w:themeColor="text1" w:themeTint="BF"/>
+    </w:rPr>
+  </w:style>
+  <w:style w:type="character" w:styleId="Strong">
+    <w:name w:val="Strong"/>
+    <w:basedOn w:val="DefaultParagraphFont"/>
+    <w:uiPriority w:val="22"/>
+    <w:qFormat/>
+    <w:rsid w:val="00F80EE7"/>
+    <w:rPr>
+      <w:b/>
+      <w:bCs/>
+    </w:rPr>
+  </w:style>
+  <w:style w:type="paragraph" w:styleId="Subtitle">
+    <w:name w:val="Subtitle"/>
+    <w:basedOn w:val="Normal"/>
+    <w:next w:val="Normal"/>
+    <w:link w:val="SubtitleChar"/>
+    <w:uiPriority w:val="11"/>
+    <w:qFormat/>
+    <w:rsid w:val="00F80EE7"/>
+    <w:pPr>
+      <w:numPr>
+        <w:ilvl w:val="1"/>
+      </w:numPr>
+      <w:spacing w:after="160"/>
+    </w:pPr>
+    <w:rPr>
+      <w:rFonts w:asciiTheme="minorHAnsi" w:eastAsiaTheme="minorEastAsia" w:hAnsiTheme="minorHAnsi" w:cstheme="minorBidi"/>
+      <w:color w:val="5A5A5A" w:themeColor="text1" w:themeTint="A5"/>
+      <w:spacing w:val="15"/>
+      <w:sz w:val="22"/>
+      <w:szCs w:val="22"/>
+    </w:rPr>
+  </w:style>
+  <w:style w:type="character" w:customStyle="1" w:styleId="SubtitleChar">
+    <w:name w:val="Subtitle Char"/>
+    <w:basedOn w:val="DefaultParagraphFont"/>
+    <w:link w:val="Subtitle"/>
+    <w:uiPriority w:val="11"/>
+    <w:rsid w:val="00F80EE7"/>
+    <w:rPr>
+      <w:rFonts w:asciiTheme="minorHAnsi" w:eastAsiaTheme="minorEastAsia" w:hAnsiTheme="minorHAnsi" w:cstheme="minorBidi"/>
+      <w:color w:val="5A5A5A" w:themeColor="text1" w:themeTint="A5"/>
+      <w:spacing w:val="15"/>
+      <w:sz w:val="22"/>
+      <w:szCs w:val="22"/>
+    </w:rPr>
+  </w:style>
+  <w:style w:type="character" w:styleId="SubtleEmphasis">
+    <w:name w:val="Subtle Emphasis"/>
+    <w:basedOn w:val="DefaultParagraphFont"/>
+    <w:uiPriority w:val="19"/>
+    <w:qFormat/>
+    <w:rsid w:val="00F80EE7"/>
+    <w:rPr>
+      <w:i/>
+      <w:iCs/>
+      <w:color w:val="404040" w:themeColor="text1" w:themeTint="BF"/>
+    </w:rPr>
+  </w:style>
+  <w:style w:type="character" w:styleId="SubtleReference">
+    <w:name w:val="Subtle Reference"/>
+    <w:basedOn w:val="DefaultParagraphFont"/>
+    <w:uiPriority w:val="31"/>
+    <w:qFormat/>
+    <w:rsid w:val="00F80EE7"/>
+    <w:rPr>
+      <w:smallCaps/>
+      <w:color w:val="5A5A5A" w:themeColor="text1" w:themeTint="A5"/>
+    </w:rPr>
+  </w:style>
+  <w:style w:type="paragraph" w:styleId="TOCHeading">
+    <w:name w:val="TOC Heading"/>
+    <w:basedOn w:val="Heading1"/>
+    <w:next w:val="Normal"/>
+    <w:uiPriority w:val="39"/>
+    <w:semiHidden/>
+    <w:unhideWhenUsed/>
+    <w:qFormat/>
+    <w:rsid w:val="00F80EE7"/>
+    <w:pPr>
+      <w:keepNext/>
+      <w:keepLines/>
+      <w:spacing w:before="240"/>
+      <w:outlineLvl w:val="9"/>
+    </w:pPr>
+    <w:rPr>
+      <w:rFonts w:asciiTheme="majorHAnsi" w:eastAsiaTheme="majorEastAsia" w:hAnsiTheme="majorHAnsi" w:cstheme="majorBidi"/>
+      <w:color w:val="0F4761" w:themeColor="accent1" w:themeShade="BF"/>
+      <w:sz w:val="32"/>
+      <w:szCs w:val="32"/>
+    </w:rPr>
+  </w:style>
+  <w:style w:type="paragraph" w:styleId="NormalWeb">
+    <w:name w:val="Normal (Web)"/>
+    <w:basedOn w:val="Normal"/>
+    <w:uiPriority w:val="99"/>
+    <w:semiHidden/>
+    <w:unhideWhenUsed/>
+    <w:rsid w:val="00F80EE7"/>
+    <w:pPr>
+      <w:spacing w:before="100" w:beforeAutospacing="1" w:after="100" w:afterAutospacing="1"/>
+    </w:pPr>
+    <w:rPr>
+      <w:rFonts w:ascii="Times New Roman" w:hAnsi="Times New Roman" w:cs="Times New Roman"/>
+      <w:sz w:val="24"/>
+      <w:szCs w:val="24"/>
+    </w:rPr>
+  </w:style>
+  <w:style w:type="character" w:customStyle="1" w:styleId="Heading2Char">
+    <w:name w:val="Heading 2 Char"/>
+    <w:basedOn w:val="DefaultParagraphFont"/>
+    <w:link w:val="Heading2"/>
+    <w:uiPriority w:val="9"/>
+    <w:rsid w:val="00F80EE7"/>
+  </w:style>
+  <w:style w:type="character" w:styleId="FollowedHyperlink">
+    <w:name w:val="FollowedHyperlink"/>
+    <w:basedOn w:val="DefaultParagraphFont"/>
+    <w:uiPriority w:val="99"/>
+    <w:semiHidden/>
+    <w:unhideWhenUsed/>
+    <w:rsid w:val="00F80EE7"/>
+    <w:rPr>
+      <w:color w:val="96607D" w:themeColor="followedHyperlink"/>
+      <w:u w:val="single"/>
     </w:rPr>
   </w:style>
 </w:styles>

</xml_diff>